<commit_message>
feat(innovations): integrate EdgeNonce zero-latency CSP streaming engine across portfolio, resume, tools, and edge copilot
</commit_message>
<xml_diff>
--- a/Ravindrakumar_Suthar_Resume.docx
+++ b/Ravindrakumar_Suthar_Resume.docx
@@ -393,7 +393,7 @@
           <w:sz w:val="19"/>
           <w:szCs w:val="19"/>
         </w:rPr>
-        <w:t xml:space="preserve">WCAG 2.1 &amp; 2.2 (Level AA / AAA), Section 508, ADA Compliance, Focus Appearance (SC 2.4.13), Focus Not Obscured (SC 2.4.11), Target Size (SC 2.5.8), axe-core, Lighthouse CI, NVDA Audits, Content Security Policy (CSP), OWASP Top 10, DOM Runtime Integrity (StateGuard.js).</w:t>
+        <w:t xml:space="preserve">WCAG 2.1 &amp; 2.2 (Level AA / AAA), Section 508, ADA Compliance, Focus Appearance (SC 2.4.13), Focus Not Obscured (SC 2.4.11), Target Size (SC 2.5.8), axe-core, Lighthouse CI, NVDA Audits, Content Security Policy (CSP), Zero-Latency Dynamic Edge CSP (EdgeNonce), OWASP Top 10, DOM Runtime Integrity (StateGuard.js).</w:t>
       </w:r>
     </w:p>
     <w:p>
@@ -1230,6 +1230,31 @@
           <w:szCs w:val="23"/>
         </w:rPr>
         <w:t xml:space="preserve">FEATURED TECHNICAL INNOVATIONS &amp; OPEN SYSTEMS</w:t>
+      </w:r>
+    </w:p>
+    <w:p>
+      <w:pPr>
+        <w:spacing w:before="25" w:after="25"/>
+      </w:pPr>
+      <w:r>
+        <w:rPr>
+          <w:rFonts w:ascii="Arial" w:hAnsi="Arial" w:cs="Arial"/>
+          <w:b/>
+          <w:bCs/>
+          <w:color w:val="1A202C"/>
+          <w:sz w:val="19"/>
+          <w:szCs w:val="19"/>
+        </w:rPr>
+        <w:t xml:space="preserve">EdgeNonce (Zero-Latency CSP Nonce Streaming Engine):</w:t>
+      </w:r>
+      <w:r>
+        <w:rPr>
+          <w:rFonts w:ascii="Arial" w:hAnsi="Arial" w:cs="Arial"/>
+          <w:color w:val="2D3748"/>
+          <w:sz w:val="19"/>
+          <w:szCs w:val="19"/>
+        </w:rPr>
+        <w:t xml:space="preserve">Enterprise Content Security Policy engine at the network edge deployed on Cloudflare Workers. Injects dynamic 128-bit cryptographic nonces into cached HTML responses via streaming HTMLRewriter in &lt;1.5ms without breaking origin CDN or AEM Dispatcher caching (100% cache retention). Enforces CSP Level 3 and satisfies PCI-DSS v4.0 (6.4.3 &amp; 11.6.1), HIPAA, and GDPR (edge-nonce.com).</w:t>
       </w:r>
     </w:p>
     <w:p>

</xml_diff>

<commit_message>
feat(innovations): add FoodScan AI dietary scanner project to portfolio and resumes
</commit_message>
<xml_diff>
--- a/Ravindrakumar_Suthar_Resume.docx
+++ b/Ravindrakumar_Suthar_Resume.docx
@@ -1230,6 +1230,31 @@
           <w:szCs w:val="23"/>
         </w:rPr>
         <w:t xml:space="preserve">FEATURED TECHNICAL INNOVATIONS &amp; OPEN SYSTEMS</w:t>
+      </w:r>
+    </w:p>
+    <w:p>
+      <w:pPr>
+        <w:spacing w:before="25" w:after="25"/>
+      </w:pPr>
+      <w:r>
+        <w:rPr>
+          <w:rFonts w:ascii="Arial" w:hAnsi="Arial" w:cs="Arial"/>
+          <w:b/>
+          <w:bCs/>
+          <w:color w:val="1A202C"/>
+          <w:sz w:val="19"/>
+          <w:szCs w:val="19"/>
+        </w:rPr>
+        <w:t xml:space="preserve">FoodScan AI (AI Dietary Scanner &amp; Label Decoder):</w:t>
+      </w:r>
+      <w:r>
+        <w:rPr>
+          <w:rFonts w:ascii="Arial" w:hAnsi="Arial" w:cs="Arial"/>
+          <w:color w:val="2D3748"/>
+          <w:sz w:val="19"/>
+          <w:szCs w:val="19"/>
+        </w:rPr>
+        <w:t xml:space="preserve">Mobile AI application officially published on the Google Play Store engineered for conscious travelers (Vegetarian, Jain, Vegan, Celiac gluten-free, and severe allergen sufferers). Leverages dual barcode scanning and multilingual OCR to decode foreign food labels (French, German, Japanese, etc.) and European E-numbers in under one second with deterministic dietary safeguards (play.google.com/store/apps/details?id=in.gen.lets.foodscan | foodscan.lets.gen.in/packaging-marks).</w:t>
       </w:r>
     </w:p>
     <w:p>

</xml_diff>

<commit_message>
feat(profile): enhance Impetus and Gatesix career roles with usability and SEO strategy
</commit_message>
<xml_diff>
--- a/Ravindrakumar_Suthar_Resume.docx
+++ b/Ravindrakumar_Suthar_Resume.docx
@@ -1013,7 +1013,7 @@
           <w:sz w:val="21"/>
           <w:szCs w:val="21"/>
         </w:rPr>
-        <w:t xml:space="preserve">Module Lead — UI Development</w:t>
+        <w:t xml:space="preserve">Module Lead — UI Development &amp; Usability Analyst</w:t>
       </w:r>
     </w:p>
     <w:p>
@@ -1064,11 +1064,82 @@
       <w:r>
         <w:rPr>
           <w:rFonts w:ascii="Arial" w:hAnsi="Arial" w:cs="Arial"/>
-          <w:color w:val="2D3748"/>
-          <w:sz w:val="19"/>
-          <w:szCs w:val="19"/>
-        </w:rPr>
-        <w:t xml:space="preserve">Led UI engineering pods for enterprise web applications, collaborating closely with senior leadership to govern UI standards and usability lifecycles.</w:t>
+          <w:b/>
+          <w:bCs/>
+          <w:color w:val="1A202C"/>
+          <w:sz w:val="19"/>
+          <w:szCs w:val="19"/>
+        </w:rPr>
+        <w:t xml:space="preserve">Led UI engineering pods and concept implementations:</w:t>
+      </w:r>
+      <w:r>
+        <w:rPr>
+          <w:rFonts w:ascii="Arial" w:hAnsi="Arial" w:cs="Arial"/>
+          <w:color w:val="2D3748"/>
+          <w:sz w:val="19"/>
+          <w:szCs w:val="19"/>
+        </w:rPr>
+        <w:t xml:space="preserve">for enterprise web clients, translating product specs into robust architectures and governing client-side standards.</w:t>
+      </w:r>
+    </w:p>
+    <w:p>
+      <w:pPr>
+        <w:spacing w:before="25" w:after="25"/>
+        <w:pStyle w:val="ListParagraph"/>
+        <w:numPr>
+          <w:ilvl w:val="0"/>
+          <w:numId w:val="2"/>
+        </w:numPr>
+      </w:pPr>
+      <w:r>
+        <w:rPr>
+          <w:rFonts w:ascii="Arial" w:hAnsi="Arial" w:cs="Arial"/>
+          <w:b/>
+          <w:bCs/>
+          <w:color w:val="1A202C"/>
+          <w:sz w:val="19"/>
+          <w:szCs w:val="19"/>
+        </w:rPr>
+        <w:t xml:space="preserve">Directed usability studies and heuristic evaluations,:</w:t>
+      </w:r>
+      <w:r>
+        <w:rPr>
+          <w:rFonts w:ascii="Arial" w:hAnsi="Arial" w:cs="Arial"/>
+          <w:color w:val="2D3748"/>
+          <w:sz w:val="19"/>
+          <w:szCs w:val="19"/>
+        </w:rPr>
+        <w:t xml:space="preserve">conducting competitive benchmarking, usability testing, and UX analysis to optimize web clients.</w:t>
+      </w:r>
+    </w:p>
+    <w:p>
+      <w:pPr>
+        <w:spacing w:before="25" w:after="25"/>
+        <w:pStyle w:val="ListParagraph"/>
+        <w:numPr>
+          <w:ilvl w:val="0"/>
+          <w:numId w:val="2"/>
+        </w:numPr>
+      </w:pPr>
+      <w:r>
+        <w:rPr>
+          <w:rFonts w:ascii="Arial" w:hAnsi="Arial" w:cs="Arial"/>
+          <w:b/>
+          <w:bCs/>
+          <w:color w:val="1A202C"/>
+          <w:sz w:val="19"/>
+          <w:szCs w:val="19"/>
+        </w:rPr>
+        <w:t xml:space="preserve">Partnered with organizational leads:</w:t>
+      </w:r>
+      <w:r>
+        <w:rPr>
+          <w:rFonts w:ascii="Arial" w:hAnsi="Arial" w:cs="Arial"/>
+          <w:color w:val="2D3748"/>
+          <w:sz w:val="19"/>
+          <w:szCs w:val="19"/>
+        </w:rPr>
+        <w:t xml:space="preserve">to drive collaborative technical discussions, architectural decisions, design standards, and industry best practices.</w:t>
       </w:r>
     </w:p>
     <w:p>
@@ -1135,11 +1206,82 @@
       <w:r>
         <w:rPr>
           <w:rFonts w:ascii="Arial" w:hAnsi="Arial" w:cs="Arial"/>
-          <w:color w:val="2D3748"/>
-          <w:sz w:val="19"/>
-          <w:szCs w:val="19"/>
-        </w:rPr>
-        <w:t xml:space="preserve">Defined design systems, development standards, SEO architecture, and W3C web compliance.</w:t>
+          <w:b/>
+          <w:bCs/>
+          <w:color w:val="1A202C"/>
+          <w:sz w:val="19"/>
+          <w:szCs w:val="19"/>
+        </w:rPr>
+        <w:t xml:space="preserve">Formulated frontend and SEO strategies:</w:t>
+      </w:r>
+      <w:r>
+        <w:rPr>
+          <w:rFonts w:ascii="Arial" w:hAnsi="Arial" w:cs="Arial"/>
+          <w:color w:val="2D3748"/>
+          <w:sz w:val="19"/>
+          <w:szCs w:val="19"/>
+        </w:rPr>
+        <w:t xml:space="preserve">spanning UI/UX design, development standards, W3C compliance, and search architecture for web applications.</w:t>
+      </w:r>
+    </w:p>
+    <w:p>
+      <w:pPr>
+        <w:spacing w:before="25" w:after="25"/>
+        <w:pStyle w:val="ListParagraph"/>
+        <w:numPr>
+          <w:ilvl w:val="0"/>
+          <w:numId w:val="2"/>
+        </w:numPr>
+      </w:pPr>
+      <w:r>
+        <w:rPr>
+          <w:rFonts w:ascii="Arial" w:hAnsi="Arial" w:cs="Arial"/>
+          <w:b/>
+          <w:bCs/>
+          <w:color w:val="1A202C"/>
+          <w:sz w:val="19"/>
+          <w:szCs w:val="19"/>
+        </w:rPr>
+        <w:t xml:space="preserve">Directed concept visualization and application flows,:</w:t>
+      </w:r>
+      <w:r>
+        <w:rPr>
+          <w:rFonts w:ascii="Arial" w:hAnsi="Arial" w:cs="Arial"/>
+          <w:color w:val="2D3748"/>
+          <w:sz w:val="19"/>
+          <w:szCs w:val="19"/>
+        </w:rPr>
+        <w:t xml:space="preserve">translating business requirements into intuitive UI designs and interactive web experiences.</w:t>
+      </w:r>
+    </w:p>
+    <w:p>
+      <w:pPr>
+        <w:spacing w:before="25" w:after="25"/>
+        <w:pStyle w:val="ListParagraph"/>
+        <w:numPr>
+          <w:ilvl w:val="0"/>
+          <w:numId w:val="2"/>
+        </w:numPr>
+      </w:pPr>
+      <w:r>
+        <w:rPr>
+          <w:rFonts w:ascii="Arial" w:hAnsi="Arial" w:cs="Arial"/>
+          <w:b/>
+          <w:bCs/>
+          <w:color w:val="1A202C"/>
+          <w:sz w:val="19"/>
+          <w:szCs w:val="19"/>
+        </w:rPr>
+        <w:t xml:space="preserve">Spearheaded client-side R&amp;D:</w:t>
+      </w:r>
+      <w:r>
+        <w:rPr>
+          <w:rFonts w:ascii="Arial" w:hAnsi="Arial" w:cs="Arial"/>
+          <w:color w:val="2D3748"/>
+          <w:sz w:val="19"/>
+          <w:szCs w:val="19"/>
+        </w:rPr>
+        <w:t xml:space="preserve">on emerging web technologies and established implementation standards across project teams.</w:t>
       </w:r>
     </w:p>
     <w:p>

</xml_diff>

<commit_message>
feat(profile): enhance Pinnacle Technosys role with portals, W3C standards, and media collateral
</commit_message>
<xml_diff>
--- a/Ravindrakumar_Suthar_Resume.docx
+++ b/Ravindrakumar_Suthar_Resume.docx
@@ -1348,11 +1348,82 @@
       <w:r>
         <w:rPr>
           <w:rFonts w:ascii="Arial" w:hAnsi="Arial" w:cs="Arial"/>
-          <w:color w:val="2D3748"/>
-          <w:sz w:val="19"/>
-          <w:szCs w:val="19"/>
-        </w:rPr>
-        <w:t xml:space="preserve">Designed and launched compliant web interfaces while conducting R&amp;D on emerging client-side web technologies.</w:t>
+          <w:b/>
+          <w:bCs/>
+          <w:color w:val="1A202C"/>
+          <w:sz w:val="19"/>
+          <w:szCs w:val="19"/>
+        </w:rPr>
+        <w:t xml:space="preserve">Designed, developed, and maintained client portals:</w:t>
+      </w:r>
+      <w:r>
+        <w:rPr>
+          <w:rFonts w:ascii="Arial" w:hAnsi="Arial" w:cs="Arial"/>
+          <w:color w:val="2D3748"/>
+          <w:sz w:val="19"/>
+          <w:szCs w:val="19"/>
+        </w:rPr>
+        <w:t xml:space="preserve">and digital marketing platforms with bespoke software integrations.</w:t>
+      </w:r>
+    </w:p>
+    <w:p>
+      <w:pPr>
+        <w:spacing w:before="25" w:after="25"/>
+        <w:pStyle w:val="ListParagraph"/>
+        <w:numPr>
+          <w:ilvl w:val="0"/>
+          <w:numId w:val="2"/>
+        </w:numPr>
+      </w:pPr>
+      <w:r>
+        <w:rPr>
+          <w:rFonts w:ascii="Arial" w:hAnsi="Arial" w:cs="Arial"/>
+          <w:b/>
+          <w:bCs/>
+          <w:color w:val="1A202C"/>
+          <w:sz w:val="19"/>
+          <w:szCs w:val="19"/>
+        </w:rPr>
+        <w:t xml:space="preserve">Engineered W3C-compliant website architectures:</w:t>
+      </w:r>
+      <w:r>
+        <w:rPr>
+          <w:rFonts w:ascii="Arial" w:hAnsi="Arial" w:cs="Arial"/>
+          <w:color w:val="2D3748"/>
+          <w:sz w:val="19"/>
+          <w:szCs w:val="19"/>
+        </w:rPr>
+        <w:t xml:space="preserve">and structured content implementations, ensuring cross-platform browser compatibility.</w:t>
+      </w:r>
+    </w:p>
+    <w:p>
+      <w:pPr>
+        <w:spacing w:before="25" w:after="25"/>
+        <w:pStyle w:val="ListParagraph"/>
+        <w:numPr>
+          <w:ilvl w:val="0"/>
+          <w:numId w:val="2"/>
+        </w:numPr>
+      </w:pPr>
+      <w:r>
+        <w:rPr>
+          <w:rFonts w:ascii="Arial" w:hAnsi="Arial" w:cs="Arial"/>
+          <w:b/>
+          <w:bCs/>
+          <w:color w:val="1A202C"/>
+          <w:sz w:val="19"/>
+          <w:szCs w:val="19"/>
+        </w:rPr>
+        <w:t xml:space="preserve">Produced interactive Flash applications:</w:t>
+      </w:r>
+      <w:r>
+        <w:rPr>
+          <w:rFonts w:ascii="Arial" w:hAnsi="Arial" w:cs="Arial"/>
+          <w:color w:val="2D3748"/>
+          <w:sz w:val="19"/>
+          <w:szCs w:val="19"/>
+        </w:rPr>
+        <w:t xml:space="preserve">and comprehensive digital media and print marketing collateral.</w:t>
       </w:r>
     </w:p>
     <w:p>

</xml_diff>

<commit_message>
feat(profile): optimize Workday ATS auto-parsing, update job locations, add leadership competencies, replace Azure DevOps with OpenShift DevOps, and remove Claude/OpenAI
</commit_message>
<xml_diff>
--- a/Ravindrakumar_Suthar_Resume.docx
+++ b/Ravindrakumar_Suthar_Resume.docx
@@ -359,16 +359,66 @@
           <w:sz w:val="19"/>
           <w:szCs w:val="19"/>
         </w:rPr>
-        <w:t xml:space="preserve">Engineering Leadership:</w:t>
-      </w:r>
-      <w:r>
-        <w:rPr>
-          <w:rFonts w:ascii="Arial" w:hAnsi="Arial" w:cs="Arial"/>
-          <w:color w:val="2D3748"/>
-          <w:sz w:val="19"/>
-          <w:szCs w:val="19"/>
-        </w:rPr>
-        <w:t xml:space="preserve">Cross-Functional Leadership, Agile &amp; Scrum Leadership, Certified ScrumMaster (CSM), SDLC Optimization, Workday Platform Uploads, Budget Management, Vendor Management, Talent Acquisition, Coaching &amp; Mentorship.</w:t>
+        <w:t xml:space="preserve">Delivery &amp; Project Governance:</w:t>
+      </w:r>
+      <w:r>
+        <w:rPr>
+          <w:rFonts w:ascii="Arial" w:hAnsi="Arial" w:cs="Arial"/>
+          <w:color w:val="2D3748"/>
+          <w:sz w:val="19"/>
+          <w:szCs w:val="19"/>
+        </w:rPr>
+        <w:t xml:space="preserve">Agile / Scrum / Kanban, Certified ScrumMaster (CSM), SDLC, Release Management, Change Management, Risk &amp; Issue Management, Budget &amp; Resource Planning, Financial Management, Executive Reporting &amp; Governance, Vendor Management.</w:t>
+      </w:r>
+    </w:p>
+    <w:p>
+      <w:pPr>
+        <w:spacing w:before="25" w:after="25"/>
+      </w:pPr>
+      <w:r>
+        <w:rPr>
+          <w:rFonts w:ascii="Arial" w:hAnsi="Arial" w:cs="Arial"/>
+          <w:b/>
+          <w:bCs/>
+          <w:color w:val="1A202C"/>
+          <w:sz w:val="19"/>
+          <w:szCs w:val="19"/>
+        </w:rPr>
+        <w:t xml:space="preserve">Enterprise Tools &amp; PM Platforms:</w:t>
+      </w:r>
+      <w:r>
+        <w:rPr>
+          <w:rFonts w:ascii="Arial" w:hAnsi="Arial" w:cs="Arial"/>
+          <w:color w:val="2D3748"/>
+          <w:sz w:val="19"/>
+          <w:szCs w:val="19"/>
+        </w:rPr>
+        <w:t xml:space="preserve">Jira, OpenShift DevOps, ServiceNow, Clarity, MS Project, GitHub Projects, Workday Platform Uploads, Workday HRIS, Adobe Experience Manager (AEM / CQ5).</w:t>
+      </w:r>
+    </w:p>
+    <w:p>
+      <w:pPr>
+        <w:spacing w:before="25" w:after="25"/>
+      </w:pPr>
+      <w:r>
+        <w:rPr>
+          <w:rFonts w:ascii="Arial" w:hAnsi="Arial" w:cs="Arial"/>
+          <w:b/>
+          <w:bCs/>
+          <w:color w:val="1A202C"/>
+          <w:sz w:val="19"/>
+          <w:szCs w:val="19"/>
+        </w:rPr>
+        <w:t xml:space="preserve">Leadership &amp; Key Competencies:</w:t>
+      </w:r>
+      <w:r>
+        <w:rPr>
+          <w:rFonts w:ascii="Arial" w:hAnsi="Arial" w:cs="Arial"/>
+          <w:color w:val="2D3748"/>
+          <w:sz w:val="19"/>
+          <w:szCs w:val="19"/>
+        </w:rPr>
+        <w:t xml:space="preserve">Cross-Functional Leadership, Strategic Thinking, Leadership and Influence, Stakeholder Management, Financial Management, Vendor Management, Communication and Presentation Skills, Decision Making, Conflict Resolution, Team Collaboration and Coaching, Talent Acquisition.</w:t>
       </w:r>
     </w:p>
     <w:p>
@@ -418,7 +468,7 @@
           <w:sz w:val="19"/>
           <w:szCs w:val="19"/>
         </w:rPr>
-        <w:t xml:space="preserve">RAG (Retrieval-Augmented Generation), Non-AEM to AEM Migration AI Agent &amp; Integrated VS Code Extension, Enterprise Prompt Engineering, AST Transformation Scripts, Devin AI Autonomous Agents, GitHub Copilot, Claude, OpenAI APIs, Google Antigravity SDK, LangChain, Automated Test Scaffolding.</w:t>
+        <w:t xml:space="preserve">RAG (Retrieval-Augmented Generation), Non-AEM to AEM Migration AI Agent &amp; Integrated VS Code Extension, Enterprise Prompt Engineering, AST Transformation Scripts, Devin AI Autonomous Agents, GitHub Copilot, Google Antigravity SDK, LangChain, Automated Test Scaffolding.</w:t>
       </w:r>
     </w:p>
     <w:p>
@@ -443,7 +493,7 @@
           <w:sz w:val="19"/>
           <w:szCs w:val="19"/>
         </w:rPr>
-        <w:t xml:space="preserve">Cloudflare Pages &amp; Workers, GitHub Actions, GitHub Advanced Security, Dependabot, Docker, Kubernetes, Adobe Experience Manager (AEM / CQ5), Workday HRIS.</w:t>
+        <w:t xml:space="preserve">Cloudflare Pages &amp; Workers, GitHub Actions, GitHub Advanced Security, Dependabot, Docker, Kubernetes.</w:t>
       </w:r>
     </w:p>
     <w:p>
@@ -478,7 +528,7 @@
           <w:sz w:val="21"/>
           <w:szCs w:val="21"/>
         </w:rPr>
-        <w:t xml:space="preserve">Assistant Vice President — Frontend Architecture &amp; Engineering Leadership</w:t>
+        <w:t xml:space="preserve">Assistant Vice President, Frontend Architecture</w:t>
       </w:r>
     </w:p>
     <w:p>
@@ -901,7 +951,7 @@
           <w:sz w:val="21"/>
           <w:szCs w:val="21"/>
         </w:rPr>
-        <w:t xml:space="preserve">Senior Consultant — CRM UI Architecture</w:t>
+        <w:t xml:space="preserve">Senior Consultant, CRM UI Architecture</w:t>
       </w:r>
     </w:p>
     <w:p>
@@ -1013,7 +1063,7 @@
           <w:sz w:val="21"/>
           <w:szCs w:val="21"/>
         </w:rPr>
-        <w:t xml:space="preserve">Module Lead — UI Development &amp; Usability Analyst</w:t>
+        <w:t xml:space="preserve">Module Lead, UI Development &amp; Usability Analyst</w:t>
       </w:r>
     </w:p>
     <w:p>
@@ -1038,7 +1088,7 @@
           <w:sz w:val="19"/>
           <w:szCs w:val="19"/>
         </w:rPr>
-        <w:t xml:space="preserve">|  India  |</w:t>
+        <w:t xml:space="preserve">|  Indore, MP, India  |</w:t>
       </w:r>
       <w:r>
         <w:rPr>
@@ -1180,7 +1230,7 @@
           <w:sz w:val="19"/>
           <w:szCs w:val="19"/>
         </w:rPr>
-        <w:t xml:space="preserve">|  India  |</w:t>
+        <w:t xml:space="preserve">|  Indore, MP, India  |</w:t>
       </w:r>
       <w:r>
         <w:rPr>
@@ -1322,7 +1372,7 @@
           <w:sz w:val="19"/>
           <w:szCs w:val="19"/>
         </w:rPr>
-        <w:t xml:space="preserve">|  India  |</w:t>
+        <w:t xml:space="preserve">|  Vadodara, Gujarat, India  |</w:t>
       </w:r>
       <w:r>
         <w:rPr>

</xml_diff>

<commit_message>
fix: make skills matrix boxes wrappable and expand BFSI to semantic full form
</commit_message>
<xml_diff>
--- a/Ravindrakumar_Suthar_Resume.docx
+++ b/Ravindrakumar_Suthar_Resume.docx
@@ -220,7 +220,7 @@
           <w:sz w:val="19"/>
           <w:szCs w:val="19"/>
         </w:rPr>
-        <w:t xml:space="preserve">designing resilient, enterprise-scale web platforms for global BFSI clients. Proven track record of leading multi-team engineering organizations, driving</w:t>
+        <w:t xml:space="preserve">designing resilient, enterprise-scale web platforms for global Banking, Financial Services, and Insurance (BFSI) clients. Proven track record of leading multi-team engineering organizations, driving</w:t>
       </w:r>
       <w:r>
         <w:rPr>
@@ -585,7 +585,7 @@
           <w:sz w:val="19"/>
           <w:szCs w:val="19"/>
         </w:rPr>
-        <w:t xml:space="preserve">Led legacy BFSI platform migration:</w:t>
+        <w:t xml:space="preserve">Led legacy Banking, Financial Services, and Insurance (BFSI) platform migration:</w:t>
       </w:r>
       <w:r>
         <w:rPr>
@@ -1567,7 +1567,7 @@
           <w:sz w:val="19"/>
           <w:szCs w:val="19"/>
         </w:rPr>
-        <w:t xml:space="preserve">Specialized browser runtime JavaScript utility that protects DOM attributes from tampering via browser developer tools. Engineered for client-side state integrity in mission-critical BFSI transactional workflows (rmsuthar.github.io/StateGuard).</w:t>
+        <w:t xml:space="preserve">Specialized browser runtime JavaScript utility that protects DOM attributes from tampering via browser developer tools. Engineered for client-side state integrity in mission-critical Banking, Financial Services, and Insurance (BFSI) transactional workflows (rmsuthar.github.io/StateGuard).</w:t>
       </w:r>
     </w:p>
     <w:p>

</xml_diff>

<commit_message>
resume: remove AVP title site-wide; use Senior Frontend Architect & Engineering Leader
</commit_message>
<xml_diff>
--- a/Ravindrakumar_Suthar_Resume.docx
+++ b/Ravindrakumar_Suthar_Resume.docx
@@ -35,7 +35,7 @@
           <w:sz w:val="21"/>
           <w:szCs w:val="21"/>
         </w:rPr>
-        <w:t xml:space="preserve">Assistant Vice President — Senior Frontend Architect &amp; Engineering Leader</w:t>
+        <w:t xml:space="preserve">Senior Frontend Architect &amp; Engineering Leader</w:t>
       </w:r>
     </w:p>
     <w:p>
@@ -127,7 +127,7 @@
           <w:sz w:val="18"/>
           <w:szCs w:val="18"/>
         </w:rPr>
-        <w:t xml:space="preserve">https://www.linkedin.com/in/ravindrasuthar/  |</w:t>
+        <w:t xml:space="preserve">linkedin.com/in/ravindrasuthar  |</w:t>
       </w:r>
       <w:r>
         <w:rPr>
@@ -138,7 +138,7 @@
           <w:sz w:val="18"/>
           <w:szCs w:val="18"/>
         </w:rPr>
-        <w:t xml:space="preserve">Portfolio:</w:t>
+        <w:t xml:space="preserve">GitHub:</w:t>
       </w:r>
       <w:r>
         <w:rPr>
@@ -147,7 +147,7 @@
           <w:sz w:val="18"/>
           <w:szCs w:val="18"/>
         </w:rPr>
-        <w:t xml:space="preserve">https://ravindra.lets.gen.in/  |</w:t>
+        <w:t xml:space="preserve">github.com/rmsuthar  |</w:t>
       </w:r>
       <w:r>
         <w:rPr>
@@ -158,7 +158,7 @@
           <w:sz w:val="18"/>
           <w:szCs w:val="18"/>
         </w:rPr>
-        <w:t xml:space="preserve">Tools:</w:t>
+        <w:t xml:space="preserve">Portfolio:</w:t>
       </w:r>
       <w:r>
         <w:rPr>
@@ -167,7 +167,7 @@
           <w:sz w:val="18"/>
           <w:szCs w:val="18"/>
         </w:rPr>
-        <w:t xml:space="preserve">https://ravindra.lets.gen.in/tools</w:t>
+        <w:t xml:space="preserve">ravindra.lets.gen.in</w:t>
       </w:r>
     </w:p>
     <w:p>
@@ -200,7 +200,7 @@
           <w:sz w:val="19"/>
           <w:szCs w:val="19"/>
         </w:rPr>
-        <w:t xml:space="preserve">Product Engineering Leader and Senior Frontend Architect with</w:t>
+        <w:t xml:space="preserve">Engineering leader with</w:t>
       </w:r>
       <w:r>
         <w:rPr>
@@ -220,27 +220,47 @@
           <w:sz w:val="19"/>
           <w:szCs w:val="19"/>
         </w:rPr>
-        <w:t xml:space="preserve">designing resilient, enterprise-scale web platforms for global Banking, Financial Services, and Insurance (BFSI) clients. Proven track record of leading multi-team engineering organizations, driving</w:t>
-      </w:r>
-      <w:r>
-        <w:rPr>
-          <w:rFonts w:ascii="Arial" w:hAnsi="Arial" w:cs="Arial"/>
-          <w:b/>
-          <w:bCs/>
-          <w:color w:val="2D3748"/>
-          <w:sz w:val="19"/>
-          <w:szCs w:val="19"/>
-        </w:rPr>
-        <w:t xml:space="preserve">Workday platform uploads and HRIS integrations</w:t>
-      </w:r>
-      <w:r>
-        <w:rPr>
-          <w:rFonts w:ascii="Arial" w:hAnsi="Arial" w:cs="Arial"/>
-          <w:color w:val="2D3748"/>
-          <w:sz w:val="19"/>
-          <w:szCs w:val="19"/>
-        </w:rPr>
-        <w:t xml:space="preserve">, modernizing legacy systems into zero-downtime micro-frontends, and establishing enterprise accessibility (WCAG 2.1 &amp; 2.2 Level AA/AAA, ADA, Section 508) and client-side security practices.</w:t>
+        <w:t xml:space="preserve">steering multi-team frontend organisations through large-scale digital transformation in regulated Banking, Financial Services, and Insurance (BFSI) environments. At Citicorp Services India, progressed through the engineering ladder from Technical Lead to</w:t>
+      </w:r>
+      <w:r>
+        <w:rPr>
+          <w:rFonts w:ascii="Arial" w:hAnsi="Arial" w:cs="Arial"/>
+          <w:b/>
+          <w:bCs/>
+          <w:color w:val="2D3748"/>
+          <w:sz w:val="19"/>
+          <w:szCs w:val="19"/>
+        </w:rPr>
+        <w:t xml:space="preserve">Senior Frontend Architect &amp; Engineering Leader</w:t>
+      </w:r>
+      <w:r>
+        <w:rPr>
+          <w:rFonts w:ascii="Arial" w:hAnsi="Arial" w:cs="Arial"/>
+          <w:color w:val="2D3748"/>
+          <w:sz w:val="19"/>
+          <w:szCs w:val="19"/>
+        </w:rPr>
+        <w:t xml:space="preserve">, building and retaining high-performance squads with sustained</w:t>
+      </w:r>
+      <w:r>
+        <w:rPr>
+          <w:rFonts w:ascii="Arial" w:hAnsi="Arial" w:cs="Arial"/>
+          <w:b/>
+          <w:bCs/>
+          <w:color w:val="2D3748"/>
+          <w:sz w:val="19"/>
+          <w:szCs w:val="19"/>
+        </w:rPr>
+        <w:t xml:space="preserve">&lt;8% attrition</w:t>
+      </w:r>
+      <w:r>
+        <w:rPr>
+          <w:rFonts w:ascii="Arial" w:hAnsi="Arial" w:cs="Arial"/>
+          <w:color w:val="2D3748"/>
+          <w:sz w:val="19"/>
+          <w:szCs w:val="19"/>
+        </w:rPr>
+        <w:t xml:space="preserve">— a benchmark exceptional in enterprise engineering.</w:t>
       </w:r>
     </w:p>
     <w:p>
@@ -254,27 +274,87 @@
           <w:sz w:val="19"/>
           <w:szCs w:val="19"/>
         </w:rPr>
-        <w:t xml:space="preserve">Deep expertise across</w:t>
-      </w:r>
-      <w:r>
-        <w:rPr>
-          <w:rFonts w:ascii="Arial" w:hAnsi="Arial" w:cs="Arial"/>
-          <w:b/>
-          <w:bCs/>
-          <w:color w:val="2D3748"/>
-          <w:sz w:val="19"/>
-          <w:szCs w:val="19"/>
-        </w:rPr>
-        <w:t xml:space="preserve">React, Next.js, TypeScript, JavaScript ES6+, micro-frontend architectures, web performance (Core Web Vitals), and generative AI developer workflows (Devin AI, GitHub Copilot)</w:t>
-      </w:r>
-      <w:r>
-        <w:rPr>
-          <w:rFonts w:ascii="Arial" w:hAnsi="Arial" w:cs="Arial"/>
-          <w:color w:val="2D3748"/>
-          <w:sz w:val="19"/>
-          <w:szCs w:val="19"/>
-        </w:rPr>
-        <w:t xml:space="preserve">. Experienced in translating complex technical roadmaps into executive narratives, managing risk, forecasting budgets, and cultivating high-retention engineering cultures (&lt;8% attrition).</w:t>
+        <w:t xml:space="preserve">Delivered measurable, executive-visible impact:</w:t>
+      </w:r>
+      <w:r>
+        <w:rPr>
+          <w:rFonts w:ascii="Arial" w:hAnsi="Arial" w:cs="Arial"/>
+          <w:b/>
+          <w:bCs/>
+          <w:color w:val="2D3748"/>
+          <w:sz w:val="19"/>
+          <w:szCs w:val="19"/>
+        </w:rPr>
+        <w:t xml:space="preserve">60% reduction in migration cycle times</w:t>
+      </w:r>
+      <w:r>
+        <w:rPr>
+          <w:rFonts w:ascii="Arial" w:hAnsi="Arial" w:cs="Arial"/>
+          <w:color w:val="2D3748"/>
+          <w:sz w:val="19"/>
+          <w:szCs w:val="19"/>
+        </w:rPr>
+        <w:t xml:space="preserve">via an autonomous AI agent &amp; integrated VS Code extension;</w:t>
+      </w:r>
+      <w:r>
+        <w:rPr>
+          <w:rFonts w:ascii="Arial" w:hAnsi="Arial" w:cs="Arial"/>
+          <w:b/>
+          <w:bCs/>
+          <w:color w:val="2D3748"/>
+          <w:sz w:val="19"/>
+          <w:szCs w:val="19"/>
+        </w:rPr>
+        <w:t xml:space="preserve">50% application load-time improvement</w:t>
+      </w:r>
+      <w:r>
+        <w:rPr>
+          <w:rFonts w:ascii="Arial" w:hAnsi="Arial" w:cs="Arial"/>
+          <w:color w:val="2D3748"/>
+          <w:sz w:val="19"/>
+          <w:szCs w:val="19"/>
+        </w:rPr>
+        <w:t xml:space="preserve">through React / Next.js performance engineering;</w:t>
+      </w:r>
+      <w:r>
+        <w:rPr>
+          <w:rFonts w:ascii="Arial" w:hAnsi="Arial" w:cs="Arial"/>
+          <w:b/>
+          <w:bCs/>
+          <w:color w:val="2D3748"/>
+          <w:sz w:val="19"/>
+          <w:szCs w:val="19"/>
+        </w:rPr>
+        <w:t xml:space="preserve">40% cut in integration complexity</w:t>
+      </w:r>
+      <w:r>
+        <w:rPr>
+          <w:rFonts w:ascii="Arial" w:hAnsi="Arial" w:cs="Arial"/>
+          <w:color w:val="2D3748"/>
+          <w:sz w:val="19"/>
+          <w:szCs w:val="19"/>
+        </w:rPr>
+        <w:t xml:space="preserve">across distributed platforms; and</w:t>
+      </w:r>
+      <w:r>
+        <w:rPr>
+          <w:rFonts w:ascii="Arial" w:hAnsi="Arial" w:cs="Arial"/>
+          <w:b/>
+          <w:bCs/>
+          <w:color w:val="2D3748"/>
+          <w:sz w:val="19"/>
+          <w:szCs w:val="19"/>
+        </w:rPr>
+        <w:t xml:space="preserve">35% developer effort saved</w:t>
+      </w:r>
+      <w:r>
+        <w:rPr>
+          <w:rFonts w:ascii="Arial" w:hAnsi="Arial" w:cs="Arial"/>
+          <w:color w:val="2D3748"/>
+          <w:sz w:val="19"/>
+          <w:szCs w:val="19"/>
+        </w:rPr>
+        <w:t xml:space="preserve">through AI-augmented workflows (Devin AI, GitHub Copilot). Deep practitioner across micro-frontend architecture, enterprise accessibility (WCAG 2.1/2.2 AA/AAA, ADA, Section 508), and agentic AI developer toolchains.</w:t>
       </w:r>
     </w:p>
     <w:p>
@@ -528,7 +608,7 @@
           <w:sz w:val="21"/>
           <w:szCs w:val="21"/>
         </w:rPr>
-        <w:t xml:space="preserve">Assistant Vice President, Frontend Architecture</w:t>
+        <w:t xml:space="preserve">Senior Frontend Architect &amp; AI Platform Lead</w:t>
       </w:r>
     </w:p>
     <w:p>
@@ -564,37 +644,37 @@
           <w:sz w:val="19"/>
           <w:szCs w:val="19"/>
         </w:rPr>
-        <w:t xml:space="preserve">May 2013 – Present</w:t>
-      </w:r>
-    </w:p>
-    <w:p>
-      <w:pPr>
-        <w:spacing w:before="25" w:after="25"/>
-        <w:pStyle w:val="ListParagraph"/>
-        <w:numPr>
-          <w:ilvl w:val="0"/>
-          <w:numId w:val="2"/>
-        </w:numPr>
-      </w:pPr>
-      <w:r>
-        <w:rPr>
-          <w:rFonts w:ascii="Arial" w:hAnsi="Arial" w:cs="Arial"/>
-          <w:b/>
-          <w:bCs/>
-          <w:color w:val="1A202C"/>
-          <w:sz w:val="19"/>
-          <w:szCs w:val="19"/>
-        </w:rPr>
-        <w:t xml:space="preserve">Led legacy Banking, Financial Services, and Insurance (BFSI) platform migration:</w:t>
-      </w:r>
-      <w:r>
-        <w:rPr>
-          <w:rFonts w:ascii="Arial" w:hAnsi="Arial" w:cs="Arial"/>
-          <w:color w:val="2D3748"/>
-          <w:sz w:val="19"/>
-          <w:szCs w:val="19"/>
-        </w:rPr>
-        <w:t xml:space="preserve">to Micro-frontend architectures across multi-team squads, ensuring 100% business continuity throughout the multi-phase rollout.</w:t>
+        <w:t xml:space="preserve">2022 – Present</w:t>
+      </w:r>
+    </w:p>
+    <w:p>
+      <w:pPr>
+        <w:spacing w:before="25" w:after="25"/>
+        <w:pStyle w:val="ListParagraph"/>
+        <w:numPr>
+          <w:ilvl w:val="0"/>
+          <w:numId w:val="2"/>
+        </w:numPr>
+      </w:pPr>
+      <w:r>
+        <w:rPr>
+          <w:rFonts w:ascii="Arial" w:hAnsi="Arial" w:cs="Arial"/>
+          <w:b/>
+          <w:bCs/>
+          <w:color w:val="1A202C"/>
+          <w:sz w:val="19"/>
+          <w:szCs w:val="19"/>
+        </w:rPr>
+        <w:t xml:space="preserve">Lead cross-functional frontend engineering squads (~12 engineers):</w:t>
+      </w:r>
+      <w:r>
+        <w:rPr>
+          <w:rFonts w:ascii="Arial" w:hAnsi="Arial" w:cs="Arial"/>
+          <w:color w:val="2D3748"/>
+          <w:sz w:val="19"/>
+          <w:szCs w:val="19"/>
+        </w:rPr>
+        <w:t xml:space="preserve">delivering enterprise Banking, Financial Services, and Insurance (BFSI) platform programmes, with sustained &lt;8% attrition through structured 1-on-1s, technical skill ladders, and internal Communities of Practice.</w:t>
       </w:r>
     </w:p>
     <w:p>
@@ -624,118 +704,28 @@
           <w:sz w:val="19"/>
           <w:szCs w:val="19"/>
         </w:rPr>
-        <w:t xml:space="preserve">Engineered a unified developer productivity platform where an autonomous AI migration agent operates directly within a custom VS Code extension — combining Retrieval-Augmented Generation (RAG), automated prompt engineering templates, and custom AST parsing scripts to migrate legacy non-AEM component trees into idiomatic Adobe Experience Manager (AEM) Core Components, HTL templates, and Sling models, slashing migration cycle times by over 60%.</w:t>
-      </w:r>
-    </w:p>
-    <w:p>
-      <w:pPr>
-        <w:spacing w:before="25" w:after="25"/>
-        <w:pStyle w:val="ListParagraph"/>
-        <w:numPr>
-          <w:ilvl w:val="0"/>
-          <w:numId w:val="2"/>
-        </w:numPr>
-      </w:pPr>
-      <w:r>
-        <w:rPr>
-          <w:rFonts w:ascii="Arial" w:hAnsi="Arial" w:cs="Arial"/>
-          <w:b/>
-          <w:bCs/>
-          <w:color w:val="1A202C"/>
-          <w:sz w:val="19"/>
-          <w:szCs w:val="19"/>
-        </w:rPr>
-        <w:t xml:space="preserve">Facilitated Workday platform uploads:</w:t>
-      </w:r>
-      <w:r>
-        <w:rPr>
-          <w:rFonts w:ascii="Arial" w:hAnsi="Arial" w:cs="Arial"/>
-          <w:color w:val="2D3748"/>
-          <w:sz w:val="19"/>
-          <w:szCs w:val="19"/>
-        </w:rPr>
-        <w:t xml:space="preserve">and HRIS configuration workflows, validating data integrity at enterprise scale with zero business disruption.</w:t>
-      </w:r>
-    </w:p>
-    <w:p>
-      <w:pPr>
-        <w:spacing w:before="25" w:after="25"/>
-        <w:pStyle w:val="ListParagraph"/>
-        <w:numPr>
-          <w:ilvl w:val="0"/>
-          <w:numId w:val="2"/>
-        </w:numPr>
-      </w:pPr>
-      <w:r>
-        <w:rPr>
-          <w:rFonts w:ascii="Arial" w:hAnsi="Arial" w:cs="Arial"/>
-          <w:b/>
-          <w:bCs/>
-          <w:color w:val="1A202C"/>
-          <w:sz w:val="19"/>
-          <w:szCs w:val="19"/>
-        </w:rPr>
-        <w:t xml:space="preserve">Architected enterprise UI, API, and iframe integrations:</w:t>
-      </w:r>
-      <w:r>
-        <w:rPr>
-          <w:rFonts w:ascii="Arial" w:hAnsi="Arial" w:cs="Arial"/>
-          <w:color w:val="2D3748"/>
-          <w:sz w:val="19"/>
-          <w:szCs w:val="19"/>
-        </w:rPr>
-        <w:t xml:space="preserve">across multiple distributed platforms, cutting integration complexity by 40% and accelerating feature time-to-market.</w:t>
-      </w:r>
-    </w:p>
-    <w:p>
-      <w:pPr>
-        <w:spacing w:before="25" w:after="25"/>
-        <w:pStyle w:val="ListParagraph"/>
-        <w:numPr>
-          <w:ilvl w:val="0"/>
-          <w:numId w:val="2"/>
-        </w:numPr>
-      </w:pPr>
-      <w:r>
-        <w:rPr>
-          <w:rFonts w:ascii="Arial" w:hAnsi="Arial" w:cs="Arial"/>
-          <w:b/>
-          <w:bCs/>
-          <w:color w:val="1A202C"/>
-          <w:sz w:val="19"/>
-          <w:szCs w:val="19"/>
-        </w:rPr>
-        <w:t xml:space="preserve">Delivered up to 50% application load-time improvements:</w:t>
-      </w:r>
-      <w:r>
-        <w:rPr>
-          <w:rFonts w:ascii="Arial" w:hAnsi="Arial" w:cs="Arial"/>
-          <w:color w:val="2D3748"/>
-          <w:sz w:val="19"/>
-          <w:szCs w:val="19"/>
-        </w:rPr>
-        <w:t xml:space="preserve">via React, Next.js, TypeScript, route-based code splitting, and automated Core Web Vitals telemetry.</w:t>
-      </w:r>
-    </w:p>
-    <w:p>
-      <w:pPr>
-        <w:spacing w:before="25" w:after="25"/>
-        <w:pStyle w:val="ListParagraph"/>
-        <w:numPr>
-          <w:ilvl w:val="0"/>
-          <w:numId w:val="2"/>
-        </w:numPr>
-      </w:pPr>
-      <w:r>
-        <w:rPr>
-          <w:rFonts w:ascii="Arial" w:hAnsi="Arial" w:cs="Arial"/>
-          <w:b/>
-          <w:bCs/>
-          <w:color w:val="1A202C"/>
-          <w:sz w:val="19"/>
-          <w:szCs w:val="19"/>
-        </w:rPr>
-        <w:t xml:space="preserve">Pioneered Devin AI and GitHub Copilot adoption:</w:t>
+        <w:t xml:space="preserve">Engineered a unified developer productivity platform combining Retrieval-Augmented Generation (RAG), automated prompt engineering, and custom AST parsing scripts to migrate legacy component trees into idiomatic AEM Core Components, HTL templates, and Sling models — slashing migration cycle times by over 60%.</w:t>
+      </w:r>
+    </w:p>
+    <w:p>
+      <w:pPr>
+        <w:spacing w:before="25" w:after="25"/>
+        <w:pStyle w:val="ListParagraph"/>
+        <w:numPr>
+          <w:ilvl w:val="0"/>
+          <w:numId w:val="2"/>
+        </w:numPr>
+      </w:pPr>
+      <w:r>
+        <w:rPr>
+          <w:rFonts w:ascii="Arial" w:hAnsi="Arial" w:cs="Arial"/>
+          <w:b/>
+          <w:bCs/>
+          <w:color w:val="1A202C"/>
+          <w:sz w:val="19"/>
+          <w:szCs w:val="19"/>
+        </w:rPr>
+        <w:t xml:space="preserve">Pioneered enterprise-wide Devin AI and GitHub Copilot adoption:</w:t>
       </w:r>
       <w:r>
         <w:rPr>
@@ -765,46 +755,16 @@
           <w:sz w:val="19"/>
           <w:szCs w:val="19"/>
         </w:rPr>
-        <w:t xml:space="preserve">Established enterprise-wide Section 508 and ADA compliance programme:</w:t>
-      </w:r>
-      <w:r>
-        <w:rPr>
-          <w:rFonts w:ascii="Arial" w:hAnsi="Arial" w:cs="Arial"/>
-          <w:color w:val="2D3748"/>
-          <w:sz w:val="19"/>
-          <w:szCs w:val="19"/>
-        </w:rPr>
-        <w:t xml:space="preserve">integrating axe-core and Lighthouse CI into GitHub Actions alongside NVDA audits, reducing post-deployment remediation spend by 60%.</w:t>
-      </w:r>
-    </w:p>
-    <w:p>
-      <w:pPr>
-        <w:spacing w:before="25" w:after="25"/>
-        <w:pStyle w:val="ListParagraph"/>
-        <w:numPr>
-          <w:ilvl w:val="0"/>
-          <w:numId w:val="2"/>
-        </w:numPr>
-      </w:pPr>
-      <w:r>
-        <w:rPr>
-          <w:rFonts w:ascii="Arial" w:hAnsi="Arial" w:cs="Arial"/>
-          <w:b/>
-          <w:bCs/>
-          <w:color w:val="1A202C"/>
-          <w:sz w:val="19"/>
-          <w:szCs w:val="19"/>
-        </w:rPr>
-        <w:t xml:space="preserve">Engineered GitHub-first DevOps pipelines:</w:t>
-      </w:r>
-      <w:r>
-        <w:rPr>
-          <w:rFonts w:ascii="Arial" w:hAnsi="Arial" w:cs="Arial"/>
-          <w:color w:val="2D3748"/>
-          <w:sz w:val="19"/>
-          <w:szCs w:val="19"/>
-        </w:rPr>
-        <w:t xml:space="preserve">using GitHub Actions, Advanced Security scanning, Dependabot auto-patching, and GitHub Projects for Agile delivery.</w:t>
+        <w:t xml:space="preserve">Executive reporting &amp; governance:</w:t>
+      </w:r>
+      <w:r>
+        <w:rPr>
+          <w:rFonts w:ascii="Arial" w:hAnsi="Arial" w:cs="Arial"/>
+          <w:color w:val="2D3748"/>
+          <w:sz w:val="19"/>
+          <w:szCs w:val="19"/>
+        </w:rPr>
+        <w:t xml:space="preserve">Translated multi-quarter engineering roadmaps into executive narratives for C-suite and global stakeholders; managed programme risk, release calendar, and vendor relationships.</w:t>
       </w:r>
     </w:p>
     <w:p>
@@ -835,36 +795,6 @@
           <w:szCs w:val="19"/>
         </w:rPr>
         <w:t xml:space="preserve">with zero business disruption through strategic migration roadmaps and coordinated cross-functional stakeholder alignments.</w:t>
-      </w:r>
-    </w:p>
-    <w:p>
-      <w:pPr>
-        <w:spacing w:before="25" w:after="25"/>
-        <w:pStyle w:val="ListParagraph"/>
-        <w:numPr>
-          <w:ilvl w:val="0"/>
-          <w:numId w:val="2"/>
-        </w:numPr>
-      </w:pPr>
-      <w:r>
-        <w:rPr>
-          <w:rFonts w:ascii="Arial" w:hAnsi="Arial" w:cs="Arial"/>
-          <w:b/>
-          <w:bCs/>
-          <w:color w:val="1A202C"/>
-          <w:sz w:val="19"/>
-          <w:szCs w:val="19"/>
-        </w:rPr>
-        <w:t xml:space="preserve">Maintained team attrition below 8%:</w:t>
-      </w:r>
-      <w:r>
-        <w:rPr>
-          <w:rFonts w:ascii="Arial" w:hAnsi="Arial" w:cs="Arial"/>
-          <w:color w:val="2D3748"/>
-          <w:sz w:val="19"/>
-          <w:szCs w:val="19"/>
-        </w:rPr>
-        <w:t xml:space="preserve">across engineering squads through structured 1-on-1s, technical skill ladders, and internal Communities of Practice.</w:t>
       </w:r>
     </w:p>
     <w:p>
@@ -880,7 +810,7 @@
           <w:sz w:val="21"/>
           <w:szCs w:val="21"/>
         </w:rPr>
-        <w:t xml:space="preserve">Senior Interactive Developer</w:t>
+        <w:t xml:space="preserve">Senior Lead Engineer — Frontend Architecture</w:t>
       </w:r>
     </w:p>
     <w:p>
@@ -896,7 +826,7 @@
           <w:sz w:val="19"/>
           <w:szCs w:val="19"/>
         </w:rPr>
-        <w:t xml:space="preserve">Sapient</w:t>
+        <w:t xml:space="preserve">Citicorp Services India Pvt. Ltd.</w:t>
       </w:r>
       <w:r>
         <w:rPr>
@@ -905,7 +835,7 @@
           <w:sz w:val="19"/>
           <w:szCs w:val="19"/>
         </w:rPr>
-        <w:t xml:space="preserve">|  Bangalore, India  |</w:t>
+        <w:t xml:space="preserve">|  Pune, India  |</w:t>
       </w:r>
       <w:r>
         <w:rPr>
@@ -916,26 +846,299 @@
           <w:sz w:val="19"/>
           <w:szCs w:val="19"/>
         </w:rPr>
-        <w:t xml:space="preserve">March 2013 – May 2013</w:t>
-      </w:r>
-    </w:p>
-    <w:p>
-      <w:pPr>
-        <w:spacing w:before="25" w:after="25"/>
-        <w:pStyle w:val="ListParagraph"/>
-        <w:numPr>
-          <w:ilvl w:val="0"/>
-          <w:numId w:val="2"/>
-        </w:numPr>
-      </w:pPr>
-      <w:r>
-        <w:rPr>
-          <w:rFonts w:ascii="Arial" w:hAnsi="Arial" w:cs="Arial"/>
-          <w:color w:val="2D3748"/>
-          <w:sz w:val="19"/>
-          <w:szCs w:val="19"/>
-        </w:rPr>
-        <w:t xml:space="preserve">Engineered high-performance responsive UI components for retail clients utilizing HTML5, CSS3, and Adobe Experience Manager (AEM / CQ5).</w:t>
+        <w:t xml:space="preserve">2018 – 2022</w:t>
+      </w:r>
+    </w:p>
+    <w:p>
+      <w:pPr>
+        <w:spacing w:before="25" w:after="25"/>
+        <w:pStyle w:val="ListParagraph"/>
+        <w:numPr>
+          <w:ilvl w:val="0"/>
+          <w:numId w:val="2"/>
+        </w:numPr>
+      </w:pPr>
+      <w:r>
+        <w:rPr>
+          <w:rFonts w:ascii="Arial" w:hAnsi="Arial" w:cs="Arial"/>
+          <w:b/>
+          <w:bCs/>
+          <w:color w:val="1A202C"/>
+          <w:sz w:val="19"/>
+          <w:szCs w:val="19"/>
+        </w:rPr>
+        <w:t xml:space="preserve">Led legacy BFSI platform migration:</w:t>
+      </w:r>
+      <w:r>
+        <w:rPr>
+          <w:rFonts w:ascii="Arial" w:hAnsi="Arial" w:cs="Arial"/>
+          <w:color w:val="2D3748"/>
+          <w:sz w:val="19"/>
+          <w:szCs w:val="19"/>
+        </w:rPr>
+        <w:t xml:space="preserve">to micro-frontend architectures across 2 squads (~8 engineers), ensuring 100% business continuity throughout the multi-phase rollout using Module Federation and npm Workspaces.</w:t>
+      </w:r>
+    </w:p>
+    <w:p>
+      <w:pPr>
+        <w:spacing w:before="25" w:after="25"/>
+        <w:pStyle w:val="ListParagraph"/>
+        <w:numPr>
+          <w:ilvl w:val="0"/>
+          <w:numId w:val="2"/>
+        </w:numPr>
+      </w:pPr>
+      <w:r>
+        <w:rPr>
+          <w:rFonts w:ascii="Arial" w:hAnsi="Arial" w:cs="Arial"/>
+          <w:b/>
+          <w:bCs/>
+          <w:color w:val="1A202C"/>
+          <w:sz w:val="19"/>
+          <w:szCs w:val="19"/>
+        </w:rPr>
+        <w:t xml:space="preserve">Delivered up to 50% application load-time improvement:</w:t>
+      </w:r>
+      <w:r>
+        <w:rPr>
+          <w:rFonts w:ascii="Arial" w:hAnsi="Arial" w:cs="Arial"/>
+          <w:color w:val="2D3748"/>
+          <w:sz w:val="19"/>
+          <w:szCs w:val="19"/>
+        </w:rPr>
+        <w:t xml:space="preserve">via React, Next.js, TypeScript, route-based code splitting, and automated Core Web Vitals telemetry integrated into CI pipelines.</w:t>
+      </w:r>
+    </w:p>
+    <w:p>
+      <w:pPr>
+        <w:spacing w:before="25" w:after="25"/>
+        <w:pStyle w:val="ListParagraph"/>
+        <w:numPr>
+          <w:ilvl w:val="0"/>
+          <w:numId w:val="2"/>
+        </w:numPr>
+      </w:pPr>
+      <w:r>
+        <w:rPr>
+          <w:rFonts w:ascii="Arial" w:hAnsi="Arial" w:cs="Arial"/>
+          <w:b/>
+          <w:bCs/>
+          <w:color w:val="1A202C"/>
+          <w:sz w:val="19"/>
+          <w:szCs w:val="19"/>
+        </w:rPr>
+        <w:t xml:space="preserve">Established enterprise-wide Section 508 and ADA compliance programme:</w:t>
+      </w:r>
+      <w:r>
+        <w:rPr>
+          <w:rFonts w:ascii="Arial" w:hAnsi="Arial" w:cs="Arial"/>
+          <w:color w:val="2D3748"/>
+          <w:sz w:val="19"/>
+          <w:szCs w:val="19"/>
+        </w:rPr>
+        <w:t xml:space="preserve">integrating axe-core and Lighthouse CI into GitHub Actions alongside NVDA screen-reader audits, reducing post-deployment remediation spend by 60%.</w:t>
+      </w:r>
+    </w:p>
+    <w:p>
+      <w:pPr>
+        <w:spacing w:before="25" w:after="25"/>
+        <w:pStyle w:val="ListParagraph"/>
+        <w:numPr>
+          <w:ilvl w:val="0"/>
+          <w:numId w:val="2"/>
+        </w:numPr>
+      </w:pPr>
+      <w:r>
+        <w:rPr>
+          <w:rFonts w:ascii="Arial" w:hAnsi="Arial" w:cs="Arial"/>
+          <w:b/>
+          <w:bCs/>
+          <w:color w:val="1A202C"/>
+          <w:sz w:val="19"/>
+          <w:szCs w:val="19"/>
+        </w:rPr>
+        <w:t xml:space="preserve">Facilitated Workday platform uploads:</w:t>
+      </w:r>
+      <w:r>
+        <w:rPr>
+          <w:rFonts w:ascii="Arial" w:hAnsi="Arial" w:cs="Arial"/>
+          <w:color w:val="2D3748"/>
+          <w:sz w:val="19"/>
+          <w:szCs w:val="19"/>
+        </w:rPr>
+        <w:t xml:space="preserve">and HRIS configuration workflows, validating data integrity at enterprise scale with zero business disruption.</w:t>
+      </w:r>
+    </w:p>
+    <w:p>
+      <w:pPr>
+        <w:spacing w:before="25" w:after="25"/>
+        <w:pStyle w:val="ListParagraph"/>
+        <w:numPr>
+          <w:ilvl w:val="0"/>
+          <w:numId w:val="2"/>
+        </w:numPr>
+      </w:pPr>
+      <w:r>
+        <w:rPr>
+          <w:rFonts w:ascii="Arial" w:hAnsi="Arial" w:cs="Arial"/>
+          <w:b/>
+          <w:bCs/>
+          <w:color w:val="1A202C"/>
+          <w:sz w:val="19"/>
+          <w:szCs w:val="19"/>
+        </w:rPr>
+        <w:t xml:space="preserve">Engineered GitHub-first DevOps pipelines:</w:t>
+      </w:r>
+      <w:r>
+        <w:rPr>
+          <w:rFonts w:ascii="Arial" w:hAnsi="Arial" w:cs="Arial"/>
+          <w:color w:val="2D3748"/>
+          <w:sz w:val="19"/>
+          <w:szCs w:val="19"/>
+        </w:rPr>
+        <w:t xml:space="preserve">using GitHub Actions, Advanced Security scanning, Dependabot auto-patching, and GitHub Projects for Agile delivery governance.</w:t>
+      </w:r>
+    </w:p>
+    <w:p>
+      <w:pPr>
+        <w:spacing w:before="120" w:after="20"/>
+      </w:pPr>
+      <w:r>
+        <w:rPr>
+          <w:rFonts w:ascii="Arial" w:hAnsi="Arial" w:cs="Arial"/>
+          <w:b/>
+          <w:bCs/>
+          <w:color w:val="1A202C"/>
+          <w:sz w:val="21"/>
+          <w:szCs w:val="21"/>
+        </w:rPr>
+        <w:t xml:space="preserve">Senior Engineer / Technical Lead — UI Architecture</w:t>
+      </w:r>
+    </w:p>
+    <w:p>
+      <w:pPr>
+        <w:spacing w:before="0" w:after="40"/>
+      </w:pPr>
+      <w:r>
+        <w:rPr>
+          <w:rFonts w:ascii="Arial" w:hAnsi="Arial" w:cs="Arial"/>
+          <w:b/>
+          <w:bCs/>
+          <w:color w:val="2B6CB0"/>
+          <w:sz w:val="19"/>
+          <w:szCs w:val="19"/>
+        </w:rPr>
+        <w:t xml:space="preserve">Citicorp Services India Pvt. Ltd.</w:t>
+      </w:r>
+      <w:r>
+        <w:rPr>
+          <w:rFonts w:ascii="Arial" w:hAnsi="Arial" w:cs="Arial"/>
+          <w:color w:val="4A5568"/>
+          <w:sz w:val="19"/>
+          <w:szCs w:val="19"/>
+        </w:rPr>
+        <w:t xml:space="preserve">|  Pune, India  |</w:t>
+      </w:r>
+      <w:r>
+        <w:rPr>
+          <w:rFonts w:ascii="Arial" w:hAnsi="Arial" w:cs="Arial"/>
+          <w:b/>
+          <w:bCs/>
+          <w:color w:val="1A56A8"/>
+          <w:sz w:val="19"/>
+          <w:szCs w:val="19"/>
+        </w:rPr>
+        <w:t xml:space="preserve">2013 – 2018</w:t>
+      </w:r>
+    </w:p>
+    <w:p>
+      <w:pPr>
+        <w:spacing w:before="25" w:after="25"/>
+        <w:pStyle w:val="ListParagraph"/>
+        <w:numPr>
+          <w:ilvl w:val="0"/>
+          <w:numId w:val="2"/>
+        </w:numPr>
+      </w:pPr>
+      <w:r>
+        <w:rPr>
+          <w:rFonts w:ascii="Arial" w:hAnsi="Arial" w:cs="Arial"/>
+          <w:b/>
+          <w:bCs/>
+          <w:color w:val="1A202C"/>
+          <w:sz w:val="19"/>
+          <w:szCs w:val="19"/>
+        </w:rPr>
+        <w:t xml:space="preserve">Architected enterprise UI, API, and iframe integrations:</w:t>
+      </w:r>
+      <w:r>
+        <w:rPr>
+          <w:rFonts w:ascii="Arial" w:hAnsi="Arial" w:cs="Arial"/>
+          <w:color w:val="2D3748"/>
+          <w:sz w:val="19"/>
+          <w:szCs w:val="19"/>
+        </w:rPr>
+        <w:t xml:space="preserve">across multiple distributed BFSI platforms, cutting integration complexity by 40% and accelerating feature time-to-market for global trading and retail banking products.</w:t>
+      </w:r>
+    </w:p>
+    <w:p>
+      <w:pPr>
+        <w:spacing w:before="25" w:after="25"/>
+        <w:pStyle w:val="ListParagraph"/>
+        <w:numPr>
+          <w:ilvl w:val="0"/>
+          <w:numId w:val="2"/>
+        </w:numPr>
+      </w:pPr>
+      <w:r>
+        <w:rPr>
+          <w:rFonts w:ascii="Arial" w:hAnsi="Arial" w:cs="Arial"/>
+          <w:b/>
+          <w:bCs/>
+          <w:color w:val="1A202C"/>
+          <w:sz w:val="19"/>
+          <w:szCs w:val="19"/>
+        </w:rPr>
+        <w:t xml:space="preserve">Established frontend architecture reference standards:</w:t>
+      </w:r>
+      <w:r>
+        <w:rPr>
+          <w:rFonts w:ascii="Arial" w:hAnsi="Arial" w:cs="Arial"/>
+          <w:color w:val="2D3748"/>
+          <w:sz w:val="19"/>
+          <w:szCs w:val="19"/>
+        </w:rPr>
+        <w:t xml:space="preserve">postMessage protocol governance, and API integration patterns adopted across 6+ product squads.</w:t>
+      </w:r>
+    </w:p>
+    <w:p>
+      <w:pPr>
+        <w:spacing w:before="25" w:after="25"/>
+        <w:pStyle w:val="ListParagraph"/>
+        <w:numPr>
+          <w:ilvl w:val="0"/>
+          <w:numId w:val="2"/>
+        </w:numPr>
+      </w:pPr>
+      <w:r>
+        <w:rPr>
+          <w:rFonts w:ascii="Arial" w:hAnsi="Arial" w:cs="Arial"/>
+          <w:b/>
+          <w:bCs/>
+          <w:color w:val="1A202C"/>
+          <w:sz w:val="19"/>
+          <w:szCs w:val="19"/>
+        </w:rPr>
+        <w:t xml:space="preserve">Built and grew a team of 4–5 frontend engineers:</w:t>
+      </w:r>
+      <w:r>
+        <w:rPr>
+          <w:rFonts w:ascii="Arial" w:hAnsi="Arial" w:cs="Arial"/>
+          <w:color w:val="2D3748"/>
+          <w:sz w:val="19"/>
+          <w:szCs w:val="19"/>
+        </w:rPr>
+        <w:t xml:space="preserve">instituting code review culture, reusable UI component libraries, and cross-browser compatibility benchmarks.</w:t>
       </w:r>
     </w:p>
     <w:p>

</xml_diff>

<commit_message>
feat: synchronize profile, ATS resume, and AI edge services with Senior Principal Architect scope
</commit_message>
<xml_diff>
--- a/Ravindrakumar_Suthar_Resume.docx
+++ b/Ravindrakumar_Suthar_Resume.docx
@@ -35,7 +35,7 @@
           <w:sz w:val="21"/>
           <w:szCs w:val="21"/>
         </w:rPr>
-        <w:t xml:space="preserve">Senior Frontend Architect &amp; Engineering Leader</w:t>
+        <w:t xml:space="preserve">Senior Principal Architect &amp; Engineering Leader</w:t>
       </w:r>
     </w:p>
     <w:p>
@@ -220,18 +220,18 @@
           <w:sz w:val="19"/>
           <w:szCs w:val="19"/>
         </w:rPr>
-        <w:t xml:space="preserve">steering multi-team frontend organisations through large-scale digital transformation in regulated Banking, Financial Services, and Insurance (BFSI) environments. At Citicorp Services India, progressed through the engineering ladder from Technical Lead to</w:t>
-      </w:r>
-      <w:r>
-        <w:rPr>
-          <w:rFonts w:ascii="Arial" w:hAnsi="Arial" w:cs="Arial"/>
-          <w:b/>
-          <w:bCs/>
-          <w:color w:val="2D3748"/>
-          <w:sz w:val="19"/>
-          <w:szCs w:val="19"/>
-        </w:rPr>
-        <w:t xml:space="preserve">Senior Frontend Architect &amp; Engineering Leader</w:t>
+        <w:t xml:space="preserve">steering multi-team engineering organisations through large-scale digital transformation in regulated Banking, Financial Services, and Insurance (BFSI) environments. At Citicorp Services India, progressed through the engineering ladder from Technical Lead to</w:t>
+      </w:r>
+      <w:r>
+        <w:rPr>
+          <w:rFonts w:ascii="Arial" w:hAnsi="Arial" w:cs="Arial"/>
+          <w:b/>
+          <w:bCs/>
+          <w:color w:val="2D3748"/>
+          <w:sz w:val="19"/>
+          <w:szCs w:val="19"/>
+        </w:rPr>
+        <w:t xml:space="preserve">Senior Principal Architect &amp; Engineering Leader</w:t>
       </w:r>
       <w:r>
         <w:rPr>
@@ -398,7 +398,7 @@
           <w:sz w:val="19"/>
           <w:szCs w:val="19"/>
         </w:rPr>
-        <w:t xml:space="preserve">Micro-frontends, Module Federation, Reference Architecture, UI SDK Development, npm &amp; Yarn Workspaces, System Design, UI Platforms, API and Iframe Integration, postMessage Protocols, Core Web Vitals, Bundle Optimization.</w:t>
+        <w:t xml:space="preserve">Micro-frontends, Module Federation, Reference Architecture, UI SDK Development, npm &amp; Yarn Workspaces, System Design, UI Platforms, API and Iframe Integration, postMessage Protocols, Core Web Vitals, Bundle Optimization, Server-Side Rendering (SSR).</w:t>
       </w:r>
     </w:p>
     <w:p>
@@ -423,7 +423,7 @@
           <w:sz w:val="19"/>
           <w:szCs w:val="19"/>
         </w:rPr>
-        <w:t xml:space="preserve">React, Next.js, TypeScript, JavaScript (ES6+), Redux, Redux Toolkit, Zustand, Tailwind CSS, Vanilla CSS, SCSS, LESS, Vite, Webpack, Babel, Cypress, Jest, React Testing Library.</w:t>
+        <w:t xml:space="preserve">React, Next.js, Angular (v10–v21), TypeScript, JavaScript (ES6+), Redux, Redux Toolkit, Zustand, Tailwind CSS, Vanilla CSS, SCSS, LESS, Vite, Webpack, Babel, Cypress, Jest, React Testing Library.</w:t>
       </w:r>
     </w:p>
     <w:p>
@@ -448,7 +448,7 @@
           <w:sz w:val="19"/>
           <w:szCs w:val="19"/>
         </w:rPr>
-        <w:t xml:space="preserve">Agile / Scrum / Kanban, Certified ScrumMaster (CSM), SDLC, Release Management, Change Management, Risk &amp; Issue Management, Budget &amp; Resource Planning, Financial Management, Executive Reporting &amp; Governance, Vendor Management.</w:t>
+        <w:t xml:space="preserve">Agile / Scrum / Kanban, Certified ScrumMaster (CSM), SDLC, Release Management, Change Management, Risk &amp; Issue Management, Budget &amp; Resource Planning, Financial Management, Executive Reporting &amp; Governance, Vendor Management, GitHub Enterprise (GHE) Migration, Renovate Bot.</w:t>
       </w:r>
     </w:p>
     <w:p>
@@ -473,7 +473,7 @@
           <w:sz w:val="19"/>
           <w:szCs w:val="19"/>
         </w:rPr>
-        <w:t xml:space="preserve">Jira, OpenShift DevOps, ServiceNow, Clarity, MS Project, GitHub Projects, Workday Platform Uploads, Workday HRIS, Adobe Experience Manager (AEM / CQ5).</w:t>
+        <w:t xml:space="preserve">Jira, OpenShift DevOps, ServiceNow, Clarity, MS Project, GitHub Projects, Workday Platform Uploads, Workday HRIS, Adobe Experience Manager (AEM / CQ5), OpenText TeamSite, Salesforce SSG Gateway, Bitbucket, TeamCity, UrbanDeploy.</w:t>
       </w:r>
     </w:p>
     <w:p>
@@ -498,7 +498,7 @@
           <w:sz w:val="19"/>
           <w:szCs w:val="19"/>
         </w:rPr>
-        <w:t xml:space="preserve">Cross-Functional Leadership, Strategic Thinking, Leadership and Influence, Stakeholder Management, Financial Management, Vendor Management, Communication and Presentation Skills, Decision Making, Conflict Resolution, Team Collaboration and Coaching, Talent Acquisition.</w:t>
+        <w:t xml:space="preserve">Cross-Functional Leadership, Strategic Thinking, Leadership and Influence, Stakeholder Management, Financial Management, Vendor Management, Communication and Presentation Skills, Decision Making, Conflict Resolution, Team Collaboration and Coaching, Talent Acquisition, Citi Ignite Innovation 2026.</w:t>
       </w:r>
     </w:p>
     <w:p>
@@ -523,7 +523,7 @@
           <w:sz w:val="19"/>
           <w:szCs w:val="19"/>
         </w:rPr>
-        <w:t xml:space="preserve">WCAG 2.1 &amp; 2.2 (Level AA / AAA), Section 508, ADA Compliance, Focus Appearance (SC 2.4.13), Focus Not Obscured (SC 2.4.11), Target Size (SC 2.5.8), axe-core, Lighthouse CI, NVDA Audits, Content Security Policy (CSP), Zero-Latency Dynamic Edge CSP (EdgeNonce), OWASP Top 10, DOM Runtime Integrity (StateGuard.js).</w:t>
+        <w:t xml:space="preserve">WCAG 2.1 &amp; 2.2 (Level AA / AAA), Section 508, ADA Compliance, Focus Appearance (SC 2.4.13), Focus Not Obscured (SC 2.4.11), Target Size (SC 2.5.8), Kaltura Player Accessibility, axe-core, Lighthouse CI, NVDA Audits, Content Security Policy (CSP), Zero-Latency Dynamic Edge CSP (EdgeNonce), OWASP Top 10, DOM Runtime Integrity (StateGuard.js), Checkmarx, CVM Remediation.</w:t>
       </w:r>
     </w:p>
     <w:p>
@@ -548,7 +548,7 @@
           <w:sz w:val="19"/>
           <w:szCs w:val="19"/>
         </w:rPr>
-        <w:t xml:space="preserve">RAG (Retrieval-Augmented Generation), Non-AEM to AEM Migration AI Agent &amp; Integrated VS Code Extension, Enterprise Prompt Engineering, AST Transformation Scripts, Devin AI Autonomous Agents, GitHub Copilot, Google Antigravity SDK, LangChain, Automated Test Scaffolding.</w:t>
+        <w:t xml:space="preserve">RAG (Retrieval-Augmented Generation), Local Vector Store RAG, Non-AEM to AEM Migration AI Agent &amp; Integrated VS Code Extension, ARC (Gemini ADK), Stylus Workspace Presets &amp; Tooling, Devin AI Autonomous Agents &amp; Devin Scheduler, GitHub Copilot, Enterprise Prompt Engineering, AST Transformation Scripts, Google Antigravity SDK, LangChain, Automated Test Scaffolding.</w:t>
       </w:r>
     </w:p>
     <w:p>
@@ -573,7 +573,7 @@
           <w:sz w:val="19"/>
           <w:szCs w:val="19"/>
         </w:rPr>
-        <w:t xml:space="preserve">Cloudflare Pages &amp; Workers, GitHub Actions, GitHub Advanced Security, Dependabot, Docker, Kubernetes.</w:t>
+        <w:t xml:space="preserve">Cloudflare Pages &amp; Workers, GitHub Actions, GitHub Advanced Security, Dependabot, Docker, Kubernetes, OpenShift, Spring Boot 4.x.</w:t>
       </w:r>
     </w:p>
     <w:p>
@@ -608,7 +608,7 @@
           <w:sz w:val="21"/>
           <w:szCs w:val="21"/>
         </w:rPr>
-        <w:t xml:space="preserve">Senior Frontend Architect &amp; AI Platform Lead</w:t>
+        <w:t xml:space="preserve">Senior Principal Architect &amp; AI Platform Lead</w:t>
       </w:r>
     </w:p>
     <w:p>
@@ -665,6 +665,96 @@
           <w:sz w:val="19"/>
           <w:szCs w:val="19"/>
         </w:rPr>
+        <w:t xml:space="preserve">Led enterprise CMS modernisation:</w:t>
+      </w:r>
+      <w:r>
+        <w:rPr>
+          <w:rFonts w:ascii="Arial" w:hAnsi="Arial" w:cs="Arial"/>
+          <w:color w:val="2D3748"/>
+          <w:sz w:val="19"/>
+          <w:szCs w:val="19"/>
+        </w:rPr>
+        <w:t xml:space="preserve">Orchestrated the full migration of Citi's OpenText TeamSite to Adobe Experience Manager (AEM), standardising content authoring workflows, component governance, and multi-brand publishing pipelines across institutional platforms.</w:t>
+      </w:r>
+    </w:p>
+    <w:p>
+      <w:pPr>
+        <w:spacing w:before="25" w:after="25"/>
+        <w:pStyle w:val="ListParagraph"/>
+        <w:numPr>
+          <w:ilvl w:val="0"/>
+          <w:numId w:val="2"/>
+        </w:numPr>
+      </w:pPr>
+      <w:r>
+        <w:rPr>
+          <w:rFonts w:ascii="Arial" w:hAnsi="Arial" w:cs="Arial"/>
+          <w:b/>
+          <w:bCs/>
+          <w:color w:val="1A202C"/>
+          <w:sz w:val="19"/>
+          <w:szCs w:val="19"/>
+        </w:rPr>
+        <w:t xml:space="preserve">Architected Autonomous Non-AEM to AEM Migration AI Agent &amp; Integrated VS Code Extension:</w:t>
+      </w:r>
+      <w:r>
+        <w:rPr>
+          <w:rFonts w:ascii="Arial" w:hAnsi="Arial" w:cs="Arial"/>
+          <w:color w:val="2D3748"/>
+          <w:sz w:val="19"/>
+          <w:szCs w:val="19"/>
+        </w:rPr>
+        <w:t xml:space="preserve">Engineered a unified developer productivity platform where an autonomous AI migration agent operates directly within a custom VS Code extension — combining Retrieval-Augmented Generation (RAG), automated prompt engineering templates, and custom AST parsing scripts to migrate legacy non-AEM component trees into idiomatic Adobe Experience Manager (AEM) Core Components, HTL templates, and Sling models, slashing migration cycle times by over 60% with automated validation.</w:t>
+      </w:r>
+    </w:p>
+    <w:p>
+      <w:pPr>
+        <w:spacing w:before="25" w:after="25"/>
+        <w:pStyle w:val="ListParagraph"/>
+        <w:numPr>
+          <w:ilvl w:val="0"/>
+          <w:numId w:val="2"/>
+        </w:numPr>
+      </w:pPr>
+      <w:r>
+        <w:rPr>
+          <w:rFonts w:ascii="Arial" w:hAnsi="Arial" w:cs="Arial"/>
+          <w:b/>
+          <w:bCs/>
+          <w:color w:val="1A202C"/>
+          <w:sz w:val="19"/>
+          <w:szCs w:val="19"/>
+        </w:rPr>
+        <w:t xml:space="preserve">Pioneered enterprise-wide Devin AI and GitHub Copilot adoption:</w:t>
+      </w:r>
+      <w:r>
+        <w:rPr>
+          <w:rFonts w:ascii="Arial" w:hAnsi="Arial" w:cs="Arial"/>
+          <w:color w:val="2D3748"/>
+          <w:sz w:val="19"/>
+          <w:szCs w:val="19"/>
+        </w:rPr>
+        <w:t xml:space="preserve">across squads, saving ~35% developer effort on boilerplate, test scaffolding, and migrations while boosting PR review velocity by 40%.</w:t>
+      </w:r>
+    </w:p>
+    <w:p>
+      <w:pPr>
+        <w:spacing w:before="25" w:after="25"/>
+        <w:pStyle w:val="ListParagraph"/>
+        <w:numPr>
+          <w:ilvl w:val="0"/>
+          <w:numId w:val="2"/>
+        </w:numPr>
+      </w:pPr>
+      <w:r>
+        <w:rPr>
+          <w:rFonts w:ascii="Arial" w:hAnsi="Arial" w:cs="Arial"/>
+          <w:b/>
+          <w:bCs/>
+          <w:color w:val="1A202C"/>
+          <w:sz w:val="19"/>
+          <w:szCs w:val="19"/>
+        </w:rPr>
         <w:t xml:space="preserve">Lead cross-functional frontend engineering squads (~12 engineers):</w:t>
       </w:r>
       <w:r>
@@ -674,67 +764,7 @@
           <w:sz w:val="19"/>
           <w:szCs w:val="19"/>
         </w:rPr>
-        <w:t xml:space="preserve">delivering enterprise Banking, Financial Services, and Insurance (BFSI) platform programmes, with sustained &lt;8% attrition through structured 1-on-1s, technical skill ladders, and internal Communities of Practice.</w:t>
-      </w:r>
-    </w:p>
-    <w:p>
-      <w:pPr>
-        <w:spacing w:before="25" w:after="25"/>
-        <w:pStyle w:val="ListParagraph"/>
-        <w:numPr>
-          <w:ilvl w:val="0"/>
-          <w:numId w:val="2"/>
-        </w:numPr>
-      </w:pPr>
-      <w:r>
-        <w:rPr>
-          <w:rFonts w:ascii="Arial" w:hAnsi="Arial" w:cs="Arial"/>
-          <w:b/>
-          <w:bCs/>
-          <w:color w:val="1A202C"/>
-          <w:sz w:val="19"/>
-          <w:szCs w:val="19"/>
-        </w:rPr>
-        <w:t xml:space="preserve">Architected Autonomous Non-AEM to AEM Migration AI Agent &amp; Integrated VS Code Extension:</w:t>
-      </w:r>
-      <w:r>
-        <w:rPr>
-          <w:rFonts w:ascii="Arial" w:hAnsi="Arial" w:cs="Arial"/>
-          <w:color w:val="2D3748"/>
-          <w:sz w:val="19"/>
-          <w:szCs w:val="19"/>
-        </w:rPr>
-        <w:t xml:space="preserve">Engineered a unified developer productivity platform combining Retrieval-Augmented Generation (RAG), automated prompt engineering, and custom AST parsing scripts to migrate legacy component trees into idiomatic AEM Core Components, HTL templates, and Sling models — slashing migration cycle times by over 60%.</w:t>
-      </w:r>
-    </w:p>
-    <w:p>
-      <w:pPr>
-        <w:spacing w:before="25" w:after="25"/>
-        <w:pStyle w:val="ListParagraph"/>
-        <w:numPr>
-          <w:ilvl w:val="0"/>
-          <w:numId w:val="2"/>
-        </w:numPr>
-      </w:pPr>
-      <w:r>
-        <w:rPr>
-          <w:rFonts w:ascii="Arial" w:hAnsi="Arial" w:cs="Arial"/>
-          <w:b/>
-          <w:bCs/>
-          <w:color w:val="1A202C"/>
-          <w:sz w:val="19"/>
-          <w:szCs w:val="19"/>
-        </w:rPr>
-        <w:t xml:space="preserve">Pioneered enterprise-wide Devin AI and GitHub Copilot adoption:</w:t>
-      </w:r>
-      <w:r>
-        <w:rPr>
-          <w:rFonts w:ascii="Arial" w:hAnsi="Arial" w:cs="Arial"/>
-          <w:color w:val="2D3748"/>
-          <w:sz w:val="19"/>
-          <w:szCs w:val="19"/>
-        </w:rPr>
-        <w:t xml:space="preserve">across squads, saving ~35% developer effort on boilerplate and test scaffolding while accelerating PR review velocity by 40%.</w:t>
+        <w:t xml:space="preserve">with sustained &lt;8% attrition through structured 1-on-1s, technical skill ladders, and internal Communities of Practice.</w:t>
       </w:r>
     </w:p>
     <w:p>
@@ -764,37 +794,217 @@
           <w:sz w:val="19"/>
           <w:szCs w:val="19"/>
         </w:rPr>
-        <w:t xml:space="preserve">Translated multi-quarter engineering roadmaps into executive narratives for C-suite and global stakeholders; managed programme risk, release calendar, and vendor relationships.</w:t>
-      </w:r>
-    </w:p>
-    <w:p>
-      <w:pPr>
-        <w:spacing w:before="25" w:after="25"/>
-        <w:pStyle w:val="ListParagraph"/>
-        <w:numPr>
-          <w:ilvl w:val="0"/>
-          <w:numId w:val="2"/>
-        </w:numPr>
-      </w:pPr>
-      <w:r>
-        <w:rPr>
-          <w:rFonts w:ascii="Arial" w:hAnsi="Arial" w:cs="Arial"/>
-          <w:b/>
-          <w:bCs/>
-          <w:color w:val="1A202C"/>
-          <w:sz w:val="19"/>
-          <w:szCs w:val="19"/>
-        </w:rPr>
-        <w:t xml:space="preserve">Managed End-of-Vendor-Support (EOVS/EOL) transitions:</w:t>
-      </w:r>
-      <w:r>
-        <w:rPr>
-          <w:rFonts w:ascii="Arial" w:hAnsi="Arial" w:cs="Arial"/>
-          <w:color w:val="2D3748"/>
-          <w:sz w:val="19"/>
-          <w:szCs w:val="19"/>
-        </w:rPr>
-        <w:t xml:space="preserve">with zero business disruption through strategic migration roadmaps and coordinated cross-functional stakeholder alignments.</w:t>
+        <w:t xml:space="preserve">Translated multi-quarter engineering roadmaps into C-suite narratives; managed programme risk, release calendar, vendor relationships, and End-of-Vendor-Support (EOVS/EOL) transitions with zero business disruption.</w:t>
+      </w:r>
+    </w:p>
+    <w:p>
+      <w:pPr>
+        <w:spacing w:before="25" w:after="25"/>
+        <w:pStyle w:val="ListParagraph"/>
+        <w:numPr>
+          <w:ilvl w:val="0"/>
+          <w:numId w:val="2"/>
+        </w:numPr>
+      </w:pPr>
+      <w:r>
+        <w:rPr>
+          <w:rFonts w:ascii="Arial" w:hAnsi="Arial" w:cs="Arial"/>
+          <w:b/>
+          <w:bCs/>
+          <w:color w:val="1A202C"/>
+          <w:sz w:val="19"/>
+          <w:szCs w:val="19"/>
+        </w:rPr>
+        <w:t xml:space="preserve">Enterprise GenAI Tooling, RAG &amp; Operational Presets (Demonstrated to Senior Leadership):</w:t>
+      </w:r>
+      <w:r>
+        <w:rPr>
+          <w:rFonts w:ascii="Arial" w:hAnsi="Arial" w:cs="Arial"/>
+          <w:color w:val="2D3748"/>
+          <w:sz w:val="19"/>
+          <w:szCs w:val="19"/>
+        </w:rPr>
+        <w:t xml:space="preserve">Enhanced integration with ARC (Gemini ADK) agent to leverage enterprise project-level Gemini LLMs rather than consuming individual developer tokens; implemented offline local vector store RAG for secure contextual retrieval within bank network boundaries. Engineered custom Stylus Workspace Presets including AEM Assistant &amp; Layout Analyser (screenshot-to-wireframe mapping to AEM layout templates), Adobe Experience Cloud (AEC) Release Tracker (automated risk tiering across Launch, Analytics, and Target), and automated JIRA JQL / EEMS CVM / Mythos release sign-off tools replacing manual validation.</w:t>
+      </w:r>
+    </w:p>
+    <w:p>
+      <w:pPr>
+        <w:spacing w:before="25" w:after="25"/>
+        <w:pStyle w:val="ListParagraph"/>
+        <w:numPr>
+          <w:ilvl w:val="0"/>
+          <w:numId w:val="2"/>
+        </w:numPr>
+      </w:pPr>
+      <w:r>
+        <w:rPr>
+          <w:rFonts w:ascii="Arial" w:hAnsi="Arial" w:cs="Arial"/>
+          <w:b/>
+          <w:bCs/>
+          <w:color w:val="1A202C"/>
+          <w:sz w:val="19"/>
+          <w:szCs w:val="19"/>
+        </w:rPr>
+        <w:t xml:space="preserve">Autonomous Code Remediation &amp; Devin Scheduler:</w:t>
+      </w:r>
+      <w:r>
+        <w:rPr>
+          <w:rFonts w:ascii="Arial" w:hAnsi="Arial" w:cs="Arial"/>
+          <w:color w:val="2D3748"/>
+          <w:sz w:val="19"/>
+          <w:szCs w:val="19"/>
+        </w:rPr>
+        <w:t xml:space="preserve">Configured Devin Scheduler workflows to automatically detect End-of-Vendor-Support (EOVS) components, generate automated pull requests, apply CCP framework Java upgrades, and update tracking JIRAs autonomously; successfully onboarded CPB and CGCPC applications across AEM, EEMS, and Drupal onto Devin post-GHE migration.</w:t>
+      </w:r>
+    </w:p>
+    <w:p>
+      <w:pPr>
+        <w:spacing w:before="25" w:after="25"/>
+        <w:pStyle w:val="ListParagraph"/>
+        <w:numPr>
+          <w:ilvl w:val="0"/>
+          <w:numId w:val="2"/>
+        </w:numPr>
+      </w:pPr>
+      <w:r>
+        <w:rPr>
+          <w:rFonts w:ascii="Arial" w:hAnsi="Arial" w:cs="Arial"/>
+          <w:b/>
+          <w:bCs/>
+          <w:color w:val="1A202C"/>
+          <w:sz w:val="19"/>
+          <w:szCs w:val="19"/>
+        </w:rPr>
+        <w:t xml:space="preserve">Strategic Platform Modernization &amp; Angular Ecosystem Upgrade:</w:t>
+      </w:r>
+      <w:r>
+        <w:rPr>
+          <w:rFonts w:ascii="Arial" w:hAnsi="Arial" w:cs="Arial"/>
+          <w:color w:val="2D3748"/>
+          <w:sz w:val="19"/>
+          <w:szCs w:val="19"/>
+        </w:rPr>
+        <w:t xml:space="preserve">Directed frontend ecosystem modernization upgrading Angular from 10.x to 21.x across MSA PCF and non-PCF services integrated seamlessly within Drupal; resolved critical Server-Side Rendering (SSR) routing challenges between PCF and non-PCF modules and spearheaded ongoing Angular component upgrades for the ESOK Intranet platform.</w:t>
+      </w:r>
+    </w:p>
+    <w:p>
+      <w:pPr>
+        <w:spacing w:before="25" w:after="25"/>
+        <w:pStyle w:val="ListParagraph"/>
+        <w:numPr>
+          <w:ilvl w:val="0"/>
+          <w:numId w:val="2"/>
+        </w:numPr>
+      </w:pPr>
+      <w:r>
+        <w:rPr>
+          <w:rFonts w:ascii="Arial" w:hAnsi="Arial" w:cs="Arial"/>
+          <w:b/>
+          <w:bCs/>
+          <w:color w:val="1A202C"/>
+          <w:sz w:val="19"/>
+          <w:szCs w:val="19"/>
+        </w:rPr>
+        <w:t xml:space="preserve">GitHub Enterprise (GHE) Migration Ownership &amp; CI/CD Optimization:</w:t>
+      </w:r>
+      <w:r>
+        <w:rPr>
+          <w:rFonts w:ascii="Arial" w:hAnsi="Arial" w:cs="Arial"/>
+          <w:color w:val="2D3748"/>
+          <w:sz w:val="19"/>
+          <w:szCs w:val="19"/>
+        </w:rPr>
+        <w:t xml:space="preserve">Assumed full technical ownership of GHE migration initiative, engineering Bitbucket cleanup automation, designing standardized repository structures, integrating Renovate for automated dependency management, and optimizing CI/CD delivery pipelines with zero downtime.</w:t>
+      </w:r>
+    </w:p>
+    <w:p>
+      <w:pPr>
+        <w:spacing w:before="25" w:after="25"/>
+        <w:pStyle w:val="ListParagraph"/>
+        <w:numPr>
+          <w:ilvl w:val="0"/>
+          <w:numId w:val="2"/>
+        </w:numPr>
+      </w:pPr>
+      <w:r>
+        <w:rPr>
+          <w:rFonts w:ascii="Arial" w:hAnsi="Arial" w:cs="Arial"/>
+          <w:b/>
+          <w:bCs/>
+          <w:color w:val="1A202C"/>
+          <w:sz w:val="19"/>
+          <w:szCs w:val="19"/>
+        </w:rPr>
+        <w:t xml:space="preserve">Enterprise Security &amp; Accessibility (WCAG 2.2 AA):</w:t>
+      </w:r>
+      <w:r>
+        <w:rPr>
+          <w:rFonts w:ascii="Arial" w:hAnsi="Arial" w:cs="Arial"/>
+          <w:color w:val="2D3748"/>
+          <w:sz w:val="19"/>
+          <w:szCs w:val="19"/>
+        </w:rPr>
+        <w:t xml:space="preserve">Spearheaded monthly analysis and resolution of critical accessibility challenges impacting Citi Global Wealth and Public Site platforms, partnering with Kaltura to engineer bespoke video player fixes for non-standard defects (WCAG 2.2 AA); systematically cleared CVM vulnerabilities and Checkmarx findings across core EEMS microservices (including Spring Boot 3.x to 4.x upgrades).</w:t>
+      </w:r>
+    </w:p>
+    <w:p>
+      <w:pPr>
+        <w:spacing w:before="25" w:after="25"/>
+        <w:pStyle w:val="ListParagraph"/>
+        <w:numPr>
+          <w:ilvl w:val="0"/>
+          <w:numId w:val="2"/>
+        </w:numPr>
+      </w:pPr>
+      <w:r>
+        <w:rPr>
+          <w:rFonts w:ascii="Arial" w:hAnsi="Arial" w:cs="Arial"/>
+          <w:b/>
+          <w:bCs/>
+          <w:color w:val="1A202C"/>
+          <w:sz w:val="19"/>
+          <w:szCs w:val="19"/>
+        </w:rPr>
+        <w:t xml:space="preserve">Salesforce Integration &amp; Production Validation Automation:</w:t>
+      </w:r>
+      <w:r>
+        <w:rPr>
+          <w:rFonts w:ascii="Arial" w:hAnsi="Arial" w:cs="Arial"/>
+          <w:color w:val="2D3748"/>
+          <w:sz w:val="19"/>
+          <w:szCs w:val="19"/>
+        </w:rPr>
+        <w:t xml:space="preserve">Delivered Contact Us backend message-routing enhancements via SSG gateway with 2026 mandatory custom security header compliance; built Shell automation suites validating EEMS APIs, container health, and OpenShift deployment statuses, slashing release validation overhead.</w:t>
+      </w:r>
+    </w:p>
+    <w:p>
+      <w:pPr>
+        <w:spacing w:before="25" w:after="25"/>
+        <w:pStyle w:val="ListParagraph"/>
+        <w:numPr>
+          <w:ilvl w:val="0"/>
+          <w:numId w:val="2"/>
+        </w:numPr>
+      </w:pPr>
+      <w:r>
+        <w:rPr>
+          <w:rFonts w:ascii="Arial" w:hAnsi="Arial" w:cs="Arial"/>
+          <w:b/>
+          <w:bCs/>
+          <w:color w:val="1A202C"/>
+          <w:sz w:val="19"/>
+          <w:szCs w:val="19"/>
+        </w:rPr>
+        <w:t xml:space="preserve">Firm-Wide Innovation (Citi Ignite 2026):</w:t>
+      </w:r>
+      <w:r>
+        <w:rPr>
+          <w:rFonts w:ascii="Arial" w:hAnsi="Arial" w:cs="Arial"/>
+          <w:color w:val="2D3748"/>
+          <w:sz w:val="19"/>
+          <w:szCs w:val="19"/>
+        </w:rPr>
+        <w:t xml:space="preserve">Volunteered for the global Citi Ignite Innovation Program 2026, actively evaluating and championing transformative engineering ideas across Citi.</w:t>
       </w:r>
     </w:p>
     <w:p>

</xml_diff>

<commit_message>
feat(experience): streamline Citicorp content by removing in-house project jargon and elevating executive tone
</commit_message>
<xml_diff>
--- a/Ravindrakumar_Suthar_Resume.docx
+++ b/Ravindrakumar_Suthar_Resume.docx
@@ -473,7 +473,7 @@
           <w:sz w:val="19"/>
           <w:szCs w:val="19"/>
         </w:rPr>
-        <w:t xml:space="preserve">Jira, OpenShift DevOps, ServiceNow, Clarity, MS Project, GitHub Projects, Workday Platform Uploads, Workday HRIS, Adobe Experience Manager (AEM / CQ5), OpenText TeamSite, Salesforce SSG Gateway, Bitbucket, TeamCity, UrbanDeploy.</w:t>
+        <w:t xml:space="preserve">Jira, OpenShift DevOps, ServiceNow, Clarity, MS Project, GitHub Projects, Workday Platform Uploads, Workday HRIS, Adobe Experience Manager (AEM / CQ5), OpenText TeamSite, Salesforce Integration, Bitbucket, TeamCity, UrbanDeploy.</w:t>
       </w:r>
     </w:p>
     <w:p>
@@ -498,7 +498,7 @@
           <w:sz w:val="19"/>
           <w:szCs w:val="19"/>
         </w:rPr>
-        <w:t xml:space="preserve">Cross-Functional Leadership, Strategic Thinking, Leadership and Influence, Stakeholder Management, Financial Management, Vendor Management, Communication and Presentation Skills, Decision Making, Conflict Resolution, Team Collaboration and Coaching, Talent Acquisition, Citi Ignite Innovation 2026.</w:t>
+        <w:t xml:space="preserve">Cross-Functional Leadership, Strategic Thinking, Leadership and Influence, Stakeholder Management, Financial Management, Vendor Management, Communication and Presentation Skills, Decision Making, Conflict Resolution, Team Collaboration and Coaching, Talent Acquisition, Organization-Wide Innovation Programs.</w:t>
       </w:r>
     </w:p>
     <w:p>
@@ -523,7 +523,7 @@
           <w:sz w:val="19"/>
           <w:szCs w:val="19"/>
         </w:rPr>
-        <w:t xml:space="preserve">WCAG 2.1 &amp; 2.2 (Level AA / AAA), Section 508, ADA Compliance, Focus Appearance (SC 2.4.13), Focus Not Obscured (SC 2.4.11), Target Size (SC 2.5.8), Kaltura Player Accessibility, axe-core, Lighthouse CI, NVDA Audits, Content Security Policy (CSP), Zero-Latency Dynamic Edge CSP (EdgeNonce), OWASP Top 10, DOM Runtime Integrity (StateGuard.js), Checkmarx, CVM Remediation.</w:t>
+        <w:t xml:space="preserve">WCAG 2.1 &amp; 2.2 (Level AA / AAA), Section 508, ADA Compliance, Focus Appearance (SC 2.4.13), Focus Not Obscured (SC 2.4.11), Target Size (SC 2.5.8), Kaltura Player Accessibility, axe-core, Lighthouse CI, NVDA Audits, Content Security Policy (CSP), Zero-Latency Dynamic Edge CSP (EdgeNonce), OWASP Top 10, DOM Runtime Integrity (StateGuard.js), Checkmarx, Vulnerability Remediation.</w:t>
       </w:r>
     </w:p>
     <w:p>
@@ -548,7 +548,7 @@
           <w:sz w:val="19"/>
           <w:szCs w:val="19"/>
         </w:rPr>
-        <w:t xml:space="preserve">RAG (Retrieval-Augmented Generation), Local Vector Store RAG, Non-AEM to AEM Migration AI Agent &amp; Integrated VS Code Extension, ARC (Gemini ADK), Stylus Workspace Presets &amp; Tooling, Devin AI Autonomous Agents &amp; Devin Scheduler, GitHub Copilot, Enterprise Prompt Engineering, AST Transformation Scripts, Google Antigravity SDK, LangChain, Automated Test Scaffolding.</w:t>
+        <w:t xml:space="preserve">RAG (Retrieval-Augmented Generation), Local Vector Store RAG, Non-AEM to AEM Migration AI Agent &amp; Integrated VS Code Extension, Enterprise Gemini LLM Integration, Developer Productivity Tooling, Devin AI Autonomous Agents &amp; Automated Pipelines, GitHub Copilot, Enterprise Prompt Engineering, AST Transformation Scripts, Google Antigravity SDK, LangChain, Automated Test Scaffolding.</w:t>
       </w:r>
     </w:p>
     <w:p>
@@ -815,46 +815,46 @@
           <w:sz w:val="19"/>
           <w:szCs w:val="19"/>
         </w:rPr>
-        <w:t xml:space="preserve">Enterprise GenAI Tooling, RAG &amp; Operational Presets (Demonstrated to Senior Leadership):</w:t>
-      </w:r>
-      <w:r>
-        <w:rPr>
-          <w:rFonts w:ascii="Arial" w:hAnsi="Arial" w:cs="Arial"/>
-          <w:color w:val="2D3748"/>
-          <w:sz w:val="19"/>
-          <w:szCs w:val="19"/>
-        </w:rPr>
-        <w:t xml:space="preserve">Enhanced integration with ARC (Gemini ADK) agent to leverage enterprise project-level Gemini LLMs rather than consuming individual developer tokens; implemented offline local vector store RAG for secure contextual retrieval within bank network boundaries. Engineered custom Stylus Workspace Presets including AEM Assistant &amp; Layout Analyser (screenshot-to-wireframe mapping to AEM layout templates), Adobe Experience Cloud (AEC) Release Tracker (automated risk tiering across Launch, Analytics, and Target), and automated JIRA JQL / EEMS CVM / Mythos release sign-off tools replacing manual validation.</w:t>
-      </w:r>
-    </w:p>
-    <w:p>
-      <w:pPr>
-        <w:spacing w:before="25" w:after="25"/>
-        <w:pStyle w:val="ListParagraph"/>
-        <w:numPr>
-          <w:ilvl w:val="0"/>
-          <w:numId w:val="2"/>
-        </w:numPr>
-      </w:pPr>
-      <w:r>
-        <w:rPr>
-          <w:rFonts w:ascii="Arial" w:hAnsi="Arial" w:cs="Arial"/>
-          <w:b/>
-          <w:bCs/>
-          <w:color w:val="1A202C"/>
-          <w:sz w:val="19"/>
-          <w:szCs w:val="19"/>
-        </w:rPr>
-        <w:t xml:space="preserve">Autonomous Code Remediation &amp; Devin Scheduler:</w:t>
-      </w:r>
-      <w:r>
-        <w:rPr>
-          <w:rFonts w:ascii="Arial" w:hAnsi="Arial" w:cs="Arial"/>
-          <w:color w:val="2D3748"/>
-          <w:sz w:val="19"/>
-          <w:szCs w:val="19"/>
-        </w:rPr>
-        <w:t xml:space="preserve">Configured Devin Scheduler workflows to automatically detect End-of-Vendor-Support (EOVS) components, generate automated pull requests, apply CCP framework Java upgrades, and update tracking JIRAs autonomously; successfully onboarded CPB and CGCPC applications across AEM, EEMS, and Drupal onto Devin post-GHE migration.</w:t>
+        <w:t xml:space="preserve">Enterprise GenAI Architecture &amp; Local Vector RAG:</w:t>
+      </w:r>
+      <w:r>
+        <w:rPr>
+          <w:rFonts w:ascii="Arial" w:hAnsi="Arial" w:cs="Arial"/>
+          <w:color w:val="2D3748"/>
+          <w:sz w:val="19"/>
+          <w:szCs w:val="19"/>
+        </w:rPr>
+        <w:t xml:space="preserve">Architected enterprise Gemini LLM integrations with offline local vector store RAG for secure contextual retrieval within banking network boundaries. Engineered developer acceleration tools including an automated AEM layout analyzer (screenshot-to-component mapping), Adobe Experience Cloud release tracking across Launch, Analytics, and Target, and automated release validation workflows.</w:t>
+      </w:r>
+    </w:p>
+    <w:p>
+      <w:pPr>
+        <w:spacing w:before="25" w:after="25"/>
+        <w:pStyle w:val="ListParagraph"/>
+        <w:numPr>
+          <w:ilvl w:val="0"/>
+          <w:numId w:val="2"/>
+        </w:numPr>
+      </w:pPr>
+      <w:r>
+        <w:rPr>
+          <w:rFonts w:ascii="Arial" w:hAnsi="Arial" w:cs="Arial"/>
+          <w:b/>
+          <w:bCs/>
+          <w:color w:val="1A202C"/>
+          <w:sz w:val="19"/>
+          <w:szCs w:val="19"/>
+        </w:rPr>
+        <w:t xml:space="preserve">Autonomous Code Remediation &amp; AI Pipelines:</w:t>
+      </w:r>
+      <w:r>
+        <w:rPr>
+          <w:rFonts w:ascii="Arial" w:hAnsi="Arial" w:cs="Arial"/>
+          <w:color w:val="2D3748"/>
+          <w:sz w:val="19"/>
+          <w:szCs w:val="19"/>
+        </w:rPr>
+        <w:t xml:space="preserve">Orchestrated autonomous AI agents (Devin) with scheduled automation pipelines to detect End-of-Vendor-Support (EOVS) components, synthesize automated pull requests, apply framework upgrades, and manage tracking workflows autonomously across institutional banking and CMS applications post-migration.</w:t>
       </w:r>
     </w:p>
     <w:p>
@@ -884,127 +884,127 @@
           <w:sz w:val="19"/>
           <w:szCs w:val="19"/>
         </w:rPr>
-        <w:t xml:space="preserve">Directed frontend ecosystem modernization upgrading Angular from 10.x to 21.x across MSA PCF and non-PCF services integrated seamlessly within Drupal; resolved critical Server-Side Rendering (SSR) routing challenges between PCF and non-PCF modules and spearheaded ongoing Angular component upgrades for the ESOK Intranet platform.</w:t>
-      </w:r>
-    </w:p>
-    <w:p>
-      <w:pPr>
-        <w:spacing w:before="25" w:after="25"/>
-        <w:pStyle w:val="ListParagraph"/>
-        <w:numPr>
-          <w:ilvl w:val="0"/>
-          <w:numId w:val="2"/>
-        </w:numPr>
-      </w:pPr>
-      <w:r>
-        <w:rPr>
-          <w:rFonts w:ascii="Arial" w:hAnsi="Arial" w:cs="Arial"/>
-          <w:b/>
-          <w:bCs/>
-          <w:color w:val="1A202C"/>
-          <w:sz w:val="19"/>
-          <w:szCs w:val="19"/>
-        </w:rPr>
-        <w:t xml:space="preserve">GitHub Enterprise (GHE) Migration Ownership &amp; CI/CD Optimization:</w:t>
-      </w:r>
-      <w:r>
-        <w:rPr>
-          <w:rFonts w:ascii="Arial" w:hAnsi="Arial" w:cs="Arial"/>
-          <w:color w:val="2D3748"/>
-          <w:sz w:val="19"/>
-          <w:szCs w:val="19"/>
-        </w:rPr>
-        <w:t xml:space="preserve">Assumed full technical ownership of GHE migration initiative, engineering Bitbucket cleanup automation, designing standardized repository structures, integrating Renovate for automated dependency management, and optimizing CI/CD delivery pipelines with zero downtime.</w:t>
-      </w:r>
-    </w:p>
-    <w:p>
-      <w:pPr>
-        <w:spacing w:before="25" w:after="25"/>
-        <w:pStyle w:val="ListParagraph"/>
-        <w:numPr>
-          <w:ilvl w:val="0"/>
-          <w:numId w:val="2"/>
-        </w:numPr>
-      </w:pPr>
-      <w:r>
-        <w:rPr>
-          <w:rFonts w:ascii="Arial" w:hAnsi="Arial" w:cs="Arial"/>
-          <w:b/>
-          <w:bCs/>
-          <w:color w:val="1A202C"/>
-          <w:sz w:val="19"/>
-          <w:szCs w:val="19"/>
-        </w:rPr>
-        <w:t xml:space="preserve">Enterprise Security &amp; Accessibility (WCAG 2.2 AA):</w:t>
-      </w:r>
-      <w:r>
-        <w:rPr>
-          <w:rFonts w:ascii="Arial" w:hAnsi="Arial" w:cs="Arial"/>
-          <w:color w:val="2D3748"/>
-          <w:sz w:val="19"/>
-          <w:szCs w:val="19"/>
-        </w:rPr>
-        <w:t xml:space="preserve">Spearheaded monthly analysis and resolution of critical accessibility challenges impacting Citi Global Wealth and Public Site platforms, partnering with Kaltura to engineer bespoke video player fixes for non-standard defects (WCAG 2.2 AA); systematically cleared CVM vulnerabilities and Checkmarx findings across core EEMS microservices (including Spring Boot 3.x to 4.x upgrades).</w:t>
-      </w:r>
-    </w:p>
-    <w:p>
-      <w:pPr>
-        <w:spacing w:before="25" w:after="25"/>
-        <w:pStyle w:val="ListParagraph"/>
-        <w:numPr>
-          <w:ilvl w:val="0"/>
-          <w:numId w:val="2"/>
-        </w:numPr>
-      </w:pPr>
-      <w:r>
-        <w:rPr>
-          <w:rFonts w:ascii="Arial" w:hAnsi="Arial" w:cs="Arial"/>
-          <w:b/>
-          <w:bCs/>
-          <w:color w:val="1A202C"/>
-          <w:sz w:val="19"/>
-          <w:szCs w:val="19"/>
-        </w:rPr>
-        <w:t xml:space="preserve">Salesforce Integration &amp; Production Validation Automation:</w:t>
-      </w:r>
-      <w:r>
-        <w:rPr>
-          <w:rFonts w:ascii="Arial" w:hAnsi="Arial" w:cs="Arial"/>
-          <w:color w:val="2D3748"/>
-          <w:sz w:val="19"/>
-          <w:szCs w:val="19"/>
-        </w:rPr>
-        <w:t xml:space="preserve">Delivered Contact Us backend message-routing enhancements via SSG gateway with 2026 mandatory custom security header compliance; built Shell automation suites validating EEMS APIs, container health, and OpenShift deployment statuses, slashing release validation overhead.</w:t>
-      </w:r>
-    </w:p>
-    <w:p>
-      <w:pPr>
-        <w:spacing w:before="25" w:after="25"/>
-        <w:pStyle w:val="ListParagraph"/>
-        <w:numPr>
-          <w:ilvl w:val="0"/>
-          <w:numId w:val="2"/>
-        </w:numPr>
-      </w:pPr>
-      <w:r>
-        <w:rPr>
-          <w:rFonts w:ascii="Arial" w:hAnsi="Arial" w:cs="Arial"/>
-          <w:b/>
-          <w:bCs/>
-          <w:color w:val="1A202C"/>
-          <w:sz w:val="19"/>
-          <w:szCs w:val="19"/>
-        </w:rPr>
-        <w:t xml:space="preserve">Firm-Wide Innovation (Citi Ignite 2026):</w:t>
-      </w:r>
-      <w:r>
-        <w:rPr>
-          <w:rFonts w:ascii="Arial" w:hAnsi="Arial" w:cs="Arial"/>
-          <w:color w:val="2D3748"/>
-          <w:sz w:val="19"/>
-          <w:szCs w:val="19"/>
-        </w:rPr>
-        <w:t xml:space="preserve">Volunteered for the global Citi Ignite Innovation Program 2026, actively evaluating and championing transformative engineering ideas across Citi.</w:t>
+        <w:t xml:space="preserve">Directed enterprise frontend ecosystem modernization, upgrading Angular applications from 10.x to 21.x across cloud-native microservices; resolved complex Server-Side Rendering (SSR) routing challenges between cloud and legacy modules, modernizing enterprise intranet platforms.</w:t>
+      </w:r>
+    </w:p>
+    <w:p>
+      <w:pPr>
+        <w:spacing w:before="25" w:after="25"/>
+        <w:pStyle w:val="ListParagraph"/>
+        <w:numPr>
+          <w:ilvl w:val="0"/>
+          <w:numId w:val="2"/>
+        </w:numPr>
+      </w:pPr>
+      <w:r>
+        <w:rPr>
+          <w:rFonts w:ascii="Arial" w:hAnsi="Arial" w:cs="Arial"/>
+          <w:b/>
+          <w:bCs/>
+          <w:color w:val="1A202C"/>
+          <w:sz w:val="19"/>
+          <w:szCs w:val="19"/>
+        </w:rPr>
+        <w:t xml:space="preserve">Enterprise Source Control Migration &amp; CI/CD Governance:</w:t>
+      </w:r>
+      <w:r>
+        <w:rPr>
+          <w:rFonts w:ascii="Arial" w:hAnsi="Arial" w:cs="Arial"/>
+          <w:color w:val="2D3748"/>
+          <w:sz w:val="19"/>
+          <w:szCs w:val="19"/>
+        </w:rPr>
+        <w:t xml:space="preserve">Assumed technical ownership of enterprise migration to GitHub Enterprise, designing standardized repository structures, integrating automated dependency management (Renovate), and optimizing CI/CD delivery pipelines with zero downtime.</w:t>
+      </w:r>
+    </w:p>
+    <w:p>
+      <w:pPr>
+        <w:spacing w:before="25" w:after="25"/>
+        <w:pStyle w:val="ListParagraph"/>
+        <w:numPr>
+          <w:ilvl w:val="0"/>
+          <w:numId w:val="2"/>
+        </w:numPr>
+      </w:pPr>
+      <w:r>
+        <w:rPr>
+          <w:rFonts w:ascii="Arial" w:hAnsi="Arial" w:cs="Arial"/>
+          <w:b/>
+          <w:bCs/>
+          <w:color w:val="1A202C"/>
+          <w:sz w:val="19"/>
+          <w:szCs w:val="19"/>
+        </w:rPr>
+        <w:t xml:space="preserve">Enterprise Security &amp; Accessibility Governance (WCAG 2.2 AA):</w:t>
+      </w:r>
+      <w:r>
+        <w:rPr>
+          <w:rFonts w:ascii="Arial" w:hAnsi="Arial" w:cs="Arial"/>
+          <w:color w:val="2D3748"/>
+          <w:sz w:val="19"/>
+          <w:szCs w:val="19"/>
+        </w:rPr>
+        <w:t xml:space="preserve">Governed platform accessibility standards across institutional client platforms, partnering with multimedia vendors to engineer bespoke player fixes for complex WCAG 2.2 AA compliance defects; systematically remediated application security vulnerabilities and static analysis findings across core microservices, including Spring Boot 3.x to 4.x upgrades.</w:t>
+      </w:r>
+    </w:p>
+    <w:p>
+      <w:pPr>
+        <w:spacing w:before="25" w:after="25"/>
+        <w:pStyle w:val="ListParagraph"/>
+        <w:numPr>
+          <w:ilvl w:val="0"/>
+          <w:numId w:val="2"/>
+        </w:numPr>
+      </w:pPr>
+      <w:r>
+        <w:rPr>
+          <w:rFonts w:ascii="Arial" w:hAnsi="Arial" w:cs="Arial"/>
+          <w:b/>
+          <w:bCs/>
+          <w:color w:val="1A202C"/>
+          <w:sz w:val="19"/>
+          <w:szCs w:val="19"/>
+        </w:rPr>
+        <w:t xml:space="preserve">Enterprise Salesforce Integration &amp; Automation:</w:t>
+      </w:r>
+      <w:r>
+        <w:rPr>
+          <w:rFonts w:ascii="Arial" w:hAnsi="Arial" w:cs="Arial"/>
+          <w:color w:val="2D3748"/>
+          <w:sz w:val="19"/>
+          <w:szCs w:val="19"/>
+        </w:rPr>
+        <w:t xml:space="preserve">Architected secure Salesforce integrations with enterprise security header compliance for customer engagement channels; engineered automated validation suites verifying API health, container readiness, and cloud deployment statuses, substantially reducing release validation overhead.</w:t>
+      </w:r>
+    </w:p>
+    <w:p>
+      <w:pPr>
+        <w:spacing w:before="25" w:after="25"/>
+        <w:pStyle w:val="ListParagraph"/>
+        <w:numPr>
+          <w:ilvl w:val="0"/>
+          <w:numId w:val="2"/>
+        </w:numPr>
+      </w:pPr>
+      <w:r>
+        <w:rPr>
+          <w:rFonts w:ascii="Arial" w:hAnsi="Arial" w:cs="Arial"/>
+          <w:b/>
+          <w:bCs/>
+          <w:color w:val="1A202C"/>
+          <w:sz w:val="19"/>
+          <w:szCs w:val="19"/>
+        </w:rPr>
+        <w:t xml:space="preserve">Organization-Level Innovation &amp; Technology Mentorship:</w:t>
+      </w:r>
+      <w:r>
+        <w:rPr>
+          <w:rFonts w:ascii="Arial" w:hAnsi="Arial" w:cs="Arial"/>
+          <w:color w:val="2D3748"/>
+          <w:sz w:val="19"/>
+          <w:szCs w:val="19"/>
+        </w:rPr>
+        <w:t xml:space="preserve">Actively contributed to organization-wide innovation programs and hackathons, evaluating and championing transformative engineering ideas and mentoring cross-functional teams across global business units.</w:t>
       </w:r>
     </w:p>
     <w:p>

</xml_diff>

<commit_message>
feat(resume): update experience metrics to 20+ years total (13+ years BFSI), harmonize action verbs, and clean legacy tech references
</commit_message>
<xml_diff>
--- a/Ravindrakumar_Suthar_Resume.docx
+++ b/Ravindrakumar_Suthar_Resume.docx
@@ -211,7 +211,27 @@
           <w:sz w:val="19"/>
           <w:szCs w:val="19"/>
         </w:rPr>
-        <w:t xml:space="preserve">17+ years of experience</w:t>
+        <w:t xml:space="preserve">20+ years of total experience</w:t>
+      </w:r>
+      <w:r>
+        <w:rPr>
+          <w:rFonts w:ascii="Arial" w:hAnsi="Arial" w:cs="Arial"/>
+          <w:color w:val="2D3748"/>
+          <w:sz w:val="19"/>
+          <w:szCs w:val="19"/>
+        </w:rPr>
+        <w:t xml:space="preserve">, including</w:t>
+      </w:r>
+      <w:r>
+        <w:rPr>
+          <w:rFonts w:ascii="Arial" w:hAnsi="Arial" w:cs="Arial"/>
+          <w:b/>
+          <w:bCs/>
+          <w:color w:val="2D3748"/>
+          <w:sz w:val="19"/>
+          <w:szCs w:val="19"/>
+        </w:rPr>
+        <w:t xml:space="preserve">13+ years in enterprise BFSI platforms</w:t>
       </w:r>
       <w:r>
         <w:rPr>
@@ -725,7 +745,7 @@
           <w:sz w:val="19"/>
           <w:szCs w:val="19"/>
         </w:rPr>
-        <w:t xml:space="preserve">Pioneered enterprise-wide Devin AI and GitHub Copilot adoption:</w:t>
+        <w:t xml:space="preserve">Championed and scaled enterprise-wide adoption of Devin AI and GitHub Copilot:</w:t>
       </w:r>
       <w:r>
         <w:rPr>
@@ -755,7 +775,7 @@
           <w:sz w:val="19"/>
           <w:szCs w:val="19"/>
         </w:rPr>
-        <w:t xml:space="preserve">Lead cross-functional frontend engineering squads (~12 engineers):</w:t>
+        <w:t xml:space="preserve">Led cross-functional frontend engineering squads (~12 engineers):</w:t>
       </w:r>
       <w:r>
         <w:rPr>
@@ -1430,7 +1450,7 @@
           <w:sz w:val="19"/>
           <w:szCs w:val="19"/>
         </w:rPr>
-        <w:t xml:space="preserve">with Siebel CRM targeting Google Chrome and enterprise tablets, boosting field-force productivity.</w:t>
+        <w:t xml:space="preserve">with Siebel CRM targeting Google Chrome and enterprise tablets, boosting field-force productivity across distributed enterprise client accounts.</w:t>
       </w:r>
     </w:p>
     <w:p>
@@ -1460,7 +1480,7 @@
           <w:sz w:val="19"/>
           <w:szCs w:val="19"/>
         </w:rPr>
-        <w:t xml:space="preserve">and led usability testing and heuristic evaluations.</w:t>
+        <w:t xml:space="preserve">established client-side performance benchmarks, and led usability testing and heuristic evaluations.</w:t>
       </w:r>
     </w:p>
     <w:p>
@@ -1877,16 +1897,16 @@
           <w:sz w:val="19"/>
           <w:szCs w:val="19"/>
         </w:rPr>
-        <w:t xml:space="preserve">Produced interactive Flash applications:</w:t>
-      </w:r>
-      <w:r>
-        <w:rPr>
-          <w:rFonts w:ascii="Arial" w:hAnsi="Arial" w:cs="Arial"/>
-          <w:color w:val="2D3748"/>
-          <w:sz w:val="19"/>
-          <w:szCs w:val="19"/>
-        </w:rPr>
-        <w:t xml:space="preserve">and comprehensive digital media and print marketing collateral.</w:t>
+        <w:t xml:space="preserve">Developed rich interactive web applications:</w:t>
+      </w:r>
+      <w:r>
+        <w:rPr>
+          <w:rFonts w:ascii="Arial" w:hAnsi="Arial" w:cs="Arial"/>
+          <w:color w:val="2D3748"/>
+          <w:sz w:val="19"/>
+          <w:szCs w:val="19"/>
+        </w:rPr>
+        <w:t xml:space="preserve">and digital media collateral, driving early adoption of standards-based browser technologies.</w:t>
       </w:r>
     </w:p>
     <w:p>

</xml_diff>

<commit_message>
docs: update professional title to Senior Principal Architect and expand technical profile details
</commit_message>
<xml_diff>
--- a/Ravindrakumar_Suthar_Resume.docx
+++ b/Ravindrakumar_Suthar_Resume.docx
@@ -628,7 +628,7 @@
           <w:sz w:val="21"/>
           <w:szCs w:val="21"/>
         </w:rPr>
-        <w:t xml:space="preserve">Senior Principal Architect &amp; AI Platform Lead</w:t>
+        <w:t xml:space="preserve">Applications Development Sr Programmer Analyst</w:t>
       </w:r>
     </w:p>
     <w:p>
@@ -1040,7 +1040,7 @@
           <w:sz w:val="21"/>
           <w:szCs w:val="21"/>
         </w:rPr>
-        <w:t xml:space="preserve">Senior Lead Engineer — Frontend Architecture</w:t>
+        <w:t xml:space="preserve">Applications Development Manager</w:t>
       </w:r>
     </w:p>
     <w:p>

</xml_diff>

<commit_message>
refactor: replace less-than symbols with text and update stylesheet version
</commit_message>
<xml_diff>
--- a/Ravindrakumar_Suthar_Resume.docx
+++ b/Ravindrakumar_Suthar_Resume.docx
@@ -784,7 +784,7 @@
           <w:sz w:val="19"/>
           <w:szCs w:val="19"/>
         </w:rPr>
-        <w:t xml:space="preserve">with sustained &lt;8% attrition through structured 1-on-1s, technical skill ladders, and internal Communities of Practice.</w:t>
+        <w:t xml:space="preserve">with sustained under 8% attrition through structured 1-on-1s, technical skill ladders, and internal Communities of Practice.</w:t>
       </w:r>
     </w:p>
     <w:p>
@@ -1975,7 +1975,7 @@
           <w:sz w:val="19"/>
           <w:szCs w:val="19"/>
         </w:rPr>
-        <w:t xml:space="preserve">Enterprise Content Security Policy engine at the network edge deployed on Cloudflare Workers. Injects dynamic 128-bit cryptographic nonces into cached HTML responses via streaming HTMLRewriter in &lt;1.5ms without breaking origin CDN or AEM Dispatcher caching (100% cache retention). Enforces CSP Level 3 and satisfies PCI-DSS v4.0 (6.4.3 &amp; 11.6.1), HIPAA, and GDPR (edge-nonce.com).</w:t>
+        <w:t xml:space="preserve">Enterprise Content Security Policy engine at the network edge deployed on Cloudflare Workers. Injects dynamic 128-bit cryptographic nonces into cached HTML responses via streaming HTMLRewriter in under 1.5ms without breaking origin CDN or AEM Dispatcher caching (100% cache retention). Enforces CSP Level 3 and satisfies PCI-DSS v4.0 (6.4.3 &amp; 11.6.1), HIPAA, and GDPR (edge-nonce.com).</w:t>
       </w:r>
     </w:p>
     <w:p>

</xml_diff>

<commit_message>
feat: add a11ysis triple-engine accessibility inspector to featured innovations and sync all resumes
</commit_message>
<xml_diff>
--- a/Ravindrakumar_Suthar_Resume.docx
+++ b/Ravindrakumar_Suthar_Resume.docx
@@ -1926,6 +1926,31 @@
           <w:szCs w:val="23"/>
         </w:rPr>
         <w:t xml:space="preserve">FEATURED TECHNICAL INNOVATIONS &amp; OPEN SYSTEMS</w:t>
+      </w:r>
+    </w:p>
+    <w:p>
+      <w:pPr>
+        <w:spacing w:before="25" w:after="25"/>
+      </w:pPr>
+      <w:r>
+        <w:rPr>
+          <w:rFonts w:ascii="Arial" w:hAnsi="Arial" w:cs="Arial"/>
+          <w:b/>
+          <w:bCs/>
+          <w:color w:val="1A202C"/>
+          <w:sz w:val="19"/>
+          <w:szCs w:val="19"/>
+        </w:rPr>
+        <w:t xml:space="preserve">a11ysis (In-Page Live Accessibility Inspector &amp; Triple-Engine Scanner):</w:t>
+      </w:r>
+      <w:r>
+        <w:rPr>
+          <w:rFonts w:ascii="Arial" w:hAnsi="Arial" w:cs="Arial"/>
+          <w:color w:val="2D3748"/>
+          <w:sz w:val="19"/>
+          <w:szCs w:val="19"/>
+        </w:rPr>
+        <w:t xml:space="preserve">Continuous digital accessibility platform engineered to eliminate audit fragmentation and noise. Combines a concurrent triple-engine consensus architecture (IBM Equal Access 4.0, Deque Axe-core 4.10, and HTML_CodeSniffer 2.5) with an interactive, collision-free Shadow DOM HUD that mounts directly onto live web applications via script tag or bookmarklet. Provides on-hover element highlighting, real-time contrast inspection, and actionable code remediation snippets with zero data retention (100% client-side DOM evaluation) across WCAG 2.1/2.2 Levels A/AA/AAA, Section 508, and EN 301 549 (a11ysis.lets.gen.in).</w:t>
       </w:r>
     </w:p>
     <w:p>

</xml_diff>

<commit_message>
feat(projects): add comprehensive enterprise company projects to resume, cv, portfolio, docx, pdf, and ai edge copilot
</commit_message>
<xml_diff>
--- a/Ravindrakumar_Suthar_Resume.docx
+++ b/Ravindrakumar_Suthar_Resume.docx
@@ -1907,6 +1907,913 @@
           <w:szCs w:val="19"/>
         </w:rPr>
         <w:t xml:space="preserve">and digital media collateral, driving early adoption of standards-based browser technologies.</w:t>
+      </w:r>
+    </w:p>
+    <w:p>
+      <w:pPr>
+        <w:pBdr>
+          <w:bottom w:val="single" w:sz="12" w:space="4" w:color="1A365D"/>
+        </w:pBdr>
+        <w:spacing w:before="260" w:after="90"/>
+      </w:pPr>
+      <w:r>
+        <w:rPr>
+          <w:rFonts w:ascii="Arial" w:hAnsi="Arial" w:cs="Arial"/>
+          <w:b/>
+          <w:bCs/>
+          <w:color w:val="1A365D"/>
+          <w:sz w:val="23"/>
+          <w:szCs w:val="23"/>
+        </w:rPr>
+        <w:t xml:space="preserve">KEY ENTERPRISE &amp; COMPANY PROJECTS</w:t>
+      </w:r>
+    </w:p>
+    <w:p>
+      <w:pPr>
+        <w:spacing w:before="110" w:after="15"/>
+      </w:pPr>
+      <w:r>
+        <w:rPr>
+          <w:rFonts w:ascii="Arial" w:hAnsi="Arial" w:cs="Arial"/>
+          <w:b/>
+          <w:bCs/>
+          <w:color w:val="1A202C"/>
+          <w:sz w:val="21"/>
+          <w:szCs w:val="21"/>
+        </w:rPr>
+        <w:t xml:space="preserve">Autonomous Non-AEM to AEM Migration AI Agent &amp; Integrated VS Code Extension</w:t>
+      </w:r>
+    </w:p>
+    <w:p>
+      <w:pPr>
+        <w:spacing w:before="0" w:after="25"/>
+      </w:pPr>
+      <w:r>
+        <w:rPr>
+          <w:rFonts w:ascii="Arial" w:hAnsi="Arial" w:cs="Arial"/>
+          <w:b/>
+          <w:bCs/>
+          <w:color w:val="2B6CB0"/>
+          <w:sz w:val="19"/>
+          <w:szCs w:val="19"/>
+        </w:rPr>
+        <w:t xml:space="preserve">Citicorp Services India Pvt. Ltd.</w:t>
+      </w:r>
+      <w:r>
+        <w:rPr>
+          <w:rFonts w:ascii="Arial" w:hAnsi="Arial" w:cs="Arial"/>
+          <w:color w:val="4A5568"/>
+          <w:sz w:val="19"/>
+          <w:szCs w:val="19"/>
+        </w:rPr>
+        <w:t xml:space="preserve">|  Lead Architect &amp; AI Platform Lead  |  2024 – Present</w:t>
+      </w:r>
+    </w:p>
+    <w:p>
+      <w:pPr>
+        <w:spacing w:before="0" w:after="30"/>
+      </w:pPr>
+      <w:r>
+        <w:rPr>
+          <w:rFonts w:ascii="Arial" w:hAnsi="Arial" w:cs="Arial"/>
+          <w:b/>
+          <w:bCs/>
+          <w:color w:val="1A202C"/>
+          <w:sz w:val="18"/>
+          <w:szCs w:val="18"/>
+        </w:rPr>
+        <w:t xml:space="preserve">Technologies:</w:t>
+      </w:r>
+      <w:r>
+        <w:rPr>
+          <w:rFonts w:ascii="Arial" w:hAnsi="Arial" w:cs="Arial"/>
+          <w:i/>
+          <w:iCs/>
+          <w:color w:val="4A5568"/>
+          <w:sz w:val="18"/>
+          <w:szCs w:val="18"/>
+        </w:rPr>
+        <w:t xml:space="preserve">Generative AI, Retrieval-Augmented Generation (RAG), Abstract Syntax Tree (AST) Parsing, VS Code Extension API, Adobe Experience Manager (AEM Core Components, HTL, Sling Models), TypeScript</w:t>
+      </w:r>
+    </w:p>
+    <w:p>
+      <w:pPr>
+        <w:spacing w:before="20" w:after="20"/>
+        <w:pStyle w:val="ListParagraph"/>
+        <w:numPr>
+          <w:ilvl w:val="0"/>
+          <w:numId w:val="2"/>
+        </w:numPr>
+      </w:pPr>
+      <w:r>
+        <w:rPr>
+          <w:rFonts w:ascii="Arial" w:hAnsi="Arial" w:cs="Arial"/>
+          <w:b/>
+          <w:bCs/>
+          <w:color w:val="1A202C"/>
+          <w:sz w:val="19"/>
+          <w:szCs w:val="19"/>
+        </w:rPr>
+        <w:t xml:space="preserve">Architecture &amp; Integration:</w:t>
+      </w:r>
+      <w:r>
+        <w:rPr>
+          <w:rFonts w:ascii="Arial" w:hAnsi="Arial" w:cs="Arial"/>
+          <w:color w:val="2D3748"/>
+          <w:sz w:val="19"/>
+          <w:szCs w:val="19"/>
+        </w:rPr>
+        <w:t xml:space="preserve">Architected an enterprise developer productivity platform that pairs an autonomous migration AI agent with a custom Visual Studio Code IDE extension to automate legacy non-AEM component conversion to modern AEM Core Components and Sling Models.</w:t>
+      </w:r>
+    </w:p>
+    <w:p>
+      <w:pPr>
+        <w:spacing w:before="20" w:after="20"/>
+        <w:pStyle w:val="ListParagraph"/>
+        <w:numPr>
+          <w:ilvl w:val="0"/>
+          <w:numId w:val="2"/>
+        </w:numPr>
+      </w:pPr>
+      <w:r>
+        <w:rPr>
+          <w:rFonts w:ascii="Arial" w:hAnsi="Arial" w:cs="Arial"/>
+          <w:b/>
+          <w:bCs/>
+          <w:color w:val="1A202C"/>
+          <w:sz w:val="19"/>
+          <w:szCs w:val="19"/>
+        </w:rPr>
+        <w:t xml:space="preserve">Contextual RAG &amp; AST Pipelines:</w:t>
+      </w:r>
+      <w:r>
+        <w:rPr>
+          <w:rFonts w:ascii="Arial" w:hAnsi="Arial" w:cs="Arial"/>
+          <w:color w:val="2D3748"/>
+          <w:sz w:val="19"/>
+          <w:szCs w:val="19"/>
+        </w:rPr>
+        <w:t xml:space="preserve">Standardized prompt engineering templates and injected repository AST hierarchies directly into developer workflows, programmatically generating production-ready HTL templates, Sling Models, and Touch UI dialogs with automated syntax validation.</w:t>
+      </w:r>
+    </w:p>
+    <w:p>
+      <w:pPr>
+        <w:spacing w:before="20" w:after="20"/>
+        <w:pStyle w:val="ListParagraph"/>
+        <w:numPr>
+          <w:ilvl w:val="0"/>
+          <w:numId w:val="2"/>
+        </w:numPr>
+      </w:pPr>
+      <w:r>
+        <w:rPr>
+          <w:rFonts w:ascii="Arial" w:hAnsi="Arial" w:cs="Arial"/>
+          <w:b/>
+          <w:bCs/>
+          <w:color w:val="1A202C"/>
+          <w:sz w:val="19"/>
+          <w:szCs w:val="19"/>
+        </w:rPr>
+        <w:t xml:space="preserve">Measurable Impact:</w:t>
+      </w:r>
+      <w:r>
+        <w:rPr>
+          <w:rFonts w:ascii="Arial" w:hAnsi="Arial" w:cs="Arial"/>
+          <w:color w:val="2D3748"/>
+          <w:sz w:val="19"/>
+          <w:szCs w:val="19"/>
+        </w:rPr>
+        <w:t xml:space="preserve">Slashed enterprise CMS replatforming timelines by over 60%, eliminated context drift, reduced manual developer translation defects to near zero, and established reusable agentic engineering standards across squads.</w:t>
+      </w:r>
+    </w:p>
+    <w:p>
+      <w:pPr>
+        <w:spacing w:before="110" w:after="15"/>
+      </w:pPr>
+      <w:r>
+        <w:rPr>
+          <w:rFonts w:ascii="Arial" w:hAnsi="Arial" w:cs="Arial"/>
+          <w:b/>
+          <w:bCs/>
+          <w:color w:val="1A202C"/>
+          <w:sz w:val="21"/>
+          <w:szCs w:val="21"/>
+        </w:rPr>
+        <w:t xml:space="preserve">Citi InView Digital Banking Platform Modernization &amp; Micro-Frontends</w:t>
+      </w:r>
+    </w:p>
+    <w:p>
+      <w:pPr>
+        <w:spacing w:before="0" w:after="25"/>
+      </w:pPr>
+      <w:r>
+        <w:rPr>
+          <w:rFonts w:ascii="Arial" w:hAnsi="Arial" w:cs="Arial"/>
+          <w:b/>
+          <w:bCs/>
+          <w:color w:val="2B6CB0"/>
+          <w:sz w:val="19"/>
+          <w:szCs w:val="19"/>
+        </w:rPr>
+        <w:t xml:space="preserve">Citicorp Services India Pvt. Ltd.</w:t>
+      </w:r>
+      <w:r>
+        <w:rPr>
+          <w:rFonts w:ascii="Arial" w:hAnsi="Arial" w:cs="Arial"/>
+          <w:color w:val="4A5568"/>
+          <w:sz w:val="19"/>
+          <w:szCs w:val="19"/>
+        </w:rPr>
+        <w:t xml:space="preserve">|  Applications Development Manager &amp; UI Architecture  |  2018 – 2022</w:t>
+      </w:r>
+    </w:p>
+    <w:p>
+      <w:pPr>
+        <w:spacing w:before="0" w:after="30"/>
+      </w:pPr>
+      <w:r>
+        <w:rPr>
+          <w:rFonts w:ascii="Arial" w:hAnsi="Arial" w:cs="Arial"/>
+          <w:b/>
+          <w:bCs/>
+          <w:color w:val="1A202C"/>
+          <w:sz w:val="18"/>
+          <w:szCs w:val="18"/>
+        </w:rPr>
+        <w:t xml:space="preserve">Technologies:</w:t>
+      </w:r>
+      <w:r>
+        <w:rPr>
+          <w:rFonts w:ascii="Arial" w:hAnsi="Arial" w:cs="Arial"/>
+          <w:i/>
+          <w:iCs/>
+          <w:color w:val="4A5568"/>
+          <w:sz w:val="18"/>
+          <w:szCs w:val="18"/>
+        </w:rPr>
+        <w:t xml:space="preserve">React, Next.js, TypeScript, Micro-Frontends (Module Federation), Webpack, Server-Side Rendering (SSR/SSG), TeamCity, IBM UrbanDeploy</w:t>
+      </w:r>
+    </w:p>
+    <w:p>
+      <w:pPr>
+        <w:spacing w:before="20" w:after="20"/>
+        <w:pStyle w:val="ListParagraph"/>
+        <w:numPr>
+          <w:ilvl w:val="0"/>
+          <w:numId w:val="2"/>
+        </w:numPr>
+      </w:pPr>
+      <w:r>
+        <w:rPr>
+          <w:rFonts w:ascii="Arial" w:hAnsi="Arial" w:cs="Arial"/>
+          <w:b/>
+          <w:bCs/>
+          <w:color w:val="1A202C"/>
+          <w:sz w:val="19"/>
+          <w:szCs w:val="19"/>
+        </w:rPr>
+        <w:t xml:space="preserve">Zero-Downtime Micro-Frontend Architecture:</w:t>
+      </w:r>
+      <w:r>
+        <w:rPr>
+          <w:rFonts w:ascii="Arial" w:hAnsi="Arial" w:cs="Arial"/>
+          <w:color w:val="2D3748"/>
+          <w:sz w:val="19"/>
+          <w:szCs w:val="19"/>
+        </w:rPr>
+        <w:t xml:space="preserve">Modernized Citi's flagship institutional wealth management and digital banking platform (Citi InView) from monolithic legacy codebases into modular, independently deployable Micro-frontends.</w:t>
+      </w:r>
+    </w:p>
+    <w:p>
+      <w:pPr>
+        <w:spacing w:before="20" w:after="20"/>
+        <w:pStyle w:val="ListParagraph"/>
+        <w:numPr>
+          <w:ilvl w:val="0"/>
+          <w:numId w:val="2"/>
+        </w:numPr>
+      </w:pPr>
+      <w:r>
+        <w:rPr>
+          <w:rFonts w:ascii="Arial" w:hAnsi="Arial" w:cs="Arial"/>
+          <w:b/>
+          <w:bCs/>
+          <w:color w:val="1A202C"/>
+          <w:sz w:val="19"/>
+          <w:szCs w:val="19"/>
+        </w:rPr>
+        <w:t xml:space="preserve">Performance &amp; Core Web Vitals:</w:t>
+      </w:r>
+      <w:r>
+        <w:rPr>
+          <w:rFonts w:ascii="Arial" w:hAnsi="Arial" w:cs="Arial"/>
+          <w:color w:val="2D3748"/>
+          <w:sz w:val="19"/>
+          <w:szCs w:val="19"/>
+        </w:rPr>
+        <w:t xml:space="preserve">Engineered route-based code-splitting, tree-shaking, server-side caching, and automated Core Web Vitals telemetry pipelines, delivering up to 50% load-time improvements.</w:t>
+      </w:r>
+    </w:p>
+    <w:p>
+      <w:pPr>
+        <w:spacing w:before="20" w:after="20"/>
+        <w:pStyle w:val="ListParagraph"/>
+        <w:numPr>
+          <w:ilvl w:val="0"/>
+          <w:numId w:val="2"/>
+        </w:numPr>
+      </w:pPr>
+      <w:r>
+        <w:rPr>
+          <w:rFonts w:ascii="Arial" w:hAnsi="Arial" w:cs="Arial"/>
+          <w:b/>
+          <w:bCs/>
+          <w:color w:val="1A202C"/>
+          <w:sz w:val="19"/>
+          <w:szCs w:val="19"/>
+        </w:rPr>
+        <w:t xml:space="preserve">Resilience &amp; Compliance:</w:t>
+      </w:r>
+      <w:r>
+        <w:rPr>
+          <w:rFonts w:ascii="Arial" w:hAnsi="Arial" w:cs="Arial"/>
+          <w:color w:val="2D3748"/>
+          <w:sz w:val="19"/>
+          <w:szCs w:val="19"/>
+        </w:rPr>
+        <w:t xml:space="preserve">Preserved 100% platform availability (zero downtime) throughout multi-year phased migrations, while reducing post-deployment accessibility remediation costs by 60% via automated axe-core and Lighthouse CI pipelines.</w:t>
+      </w:r>
+    </w:p>
+    <w:p>
+      <w:pPr>
+        <w:spacing w:before="110" w:after="15"/>
+      </w:pPr>
+      <w:r>
+        <w:rPr>
+          <w:rFonts w:ascii="Arial" w:hAnsi="Arial" w:cs="Arial"/>
+          <w:b/>
+          <w:bCs/>
+          <w:color w:val="1A202C"/>
+          <w:sz w:val="21"/>
+          <w:szCs w:val="21"/>
+        </w:rPr>
+        <w:t xml:space="preserve">Citi InView Real-Time Alerts, Notifications &amp; UI Integration Framework</w:t>
+      </w:r>
+    </w:p>
+    <w:p>
+      <w:pPr>
+        <w:spacing w:before="0" w:after="25"/>
+      </w:pPr>
+      <w:r>
+        <w:rPr>
+          <w:rFonts w:ascii="Arial" w:hAnsi="Arial" w:cs="Arial"/>
+          <w:b/>
+          <w:bCs/>
+          <w:color w:val="2B6CB0"/>
+          <w:sz w:val="19"/>
+          <w:szCs w:val="19"/>
+        </w:rPr>
+        <w:t xml:space="preserve">Citicorp Services India Pvt. Ltd.</w:t>
+      </w:r>
+      <w:r>
+        <w:rPr>
+          <w:rFonts w:ascii="Arial" w:hAnsi="Arial" w:cs="Arial"/>
+          <w:color w:val="4A5568"/>
+          <w:sz w:val="19"/>
+          <w:szCs w:val="19"/>
+        </w:rPr>
+        <w:t xml:space="preserve">|  Senior Engineer / Technical Lead — UI Architecture  |  2013 – 2018</w:t>
+      </w:r>
+    </w:p>
+    <w:p>
+      <w:pPr>
+        <w:spacing w:before="0" w:after="30"/>
+      </w:pPr>
+      <w:r>
+        <w:rPr>
+          <w:rFonts w:ascii="Arial" w:hAnsi="Arial" w:cs="Arial"/>
+          <w:b/>
+          <w:bCs/>
+          <w:color w:val="1A202C"/>
+          <w:sz w:val="18"/>
+          <w:szCs w:val="18"/>
+        </w:rPr>
+        <w:t xml:space="preserve">Technologies:</w:t>
+      </w:r>
+      <w:r>
+        <w:rPr>
+          <w:rFonts w:ascii="Arial" w:hAnsi="Arial" w:cs="Arial"/>
+          <w:i/>
+          <w:iCs/>
+          <w:color w:val="4A5568"/>
+          <w:sz w:val="18"/>
+          <w:szCs w:val="18"/>
+        </w:rPr>
+        <w:t xml:space="preserve">JavaScript (ES6+), InView UI Framework, postMessage Protocol, Secure Iframe Governance, REST APIs, WebSockets</w:t>
+      </w:r>
+    </w:p>
+    <w:p>
+      <w:pPr>
+        <w:spacing w:before="20" w:after="20"/>
+        <w:pStyle w:val="ListParagraph"/>
+        <w:numPr>
+          <w:ilvl w:val="0"/>
+          <w:numId w:val="2"/>
+        </w:numPr>
+      </w:pPr>
+      <w:r>
+        <w:rPr>
+          <w:rFonts w:ascii="Arial" w:hAnsi="Arial" w:cs="Arial"/>
+          <w:b/>
+          <w:bCs/>
+          <w:color w:val="1A202C"/>
+          <w:sz w:val="19"/>
+          <w:szCs w:val="19"/>
+        </w:rPr>
+        <w:t xml:space="preserve">Enterprise Alerts Engine:</w:t>
+      </w:r>
+      <w:r>
+        <w:rPr>
+          <w:rFonts w:ascii="Arial" w:hAnsi="Arial" w:cs="Arial"/>
+          <w:color w:val="2D3748"/>
+          <w:sz w:val="19"/>
+          <w:szCs w:val="19"/>
+        </w:rPr>
+        <w:t xml:space="preserve">Built and delivered mission-critical Citi InView platform modules, including the high-frequency Alerts &amp; Notifications engine handling real-time account triggers, threshold alerts, and trade execution events for institutional clients worldwide.</w:t>
+      </w:r>
+    </w:p>
+    <w:p>
+      <w:pPr>
+        <w:spacing w:before="20" w:after="20"/>
+        <w:pStyle w:val="ListParagraph"/>
+        <w:numPr>
+          <w:ilvl w:val="0"/>
+          <w:numId w:val="2"/>
+        </w:numPr>
+      </w:pPr>
+      <w:r>
+        <w:rPr>
+          <w:rFonts w:ascii="Arial" w:hAnsi="Arial" w:cs="Arial"/>
+          <w:b/>
+          <w:bCs/>
+          <w:color w:val="1A202C"/>
+          <w:sz w:val="19"/>
+          <w:szCs w:val="19"/>
+        </w:rPr>
+        <w:t xml:space="preserve">Core UI Framework &amp; Integration Standards:</w:t>
+      </w:r>
+      <w:r>
+        <w:rPr>
+          <w:rFonts w:ascii="Arial" w:hAnsi="Arial" w:cs="Arial"/>
+          <w:color w:val="2D3748"/>
+          <w:sz w:val="19"/>
+          <w:szCs w:val="19"/>
+        </w:rPr>
+        <w:t xml:space="preserve">Engineered the foundational InView UI Framework and standardized postMessage protocol governance for secure cross-domain iframe integration across 6+ product squads.</w:t>
+      </w:r>
+    </w:p>
+    <w:p>
+      <w:pPr>
+        <w:spacing w:before="20" w:after="20"/>
+        <w:pStyle w:val="ListParagraph"/>
+        <w:numPr>
+          <w:ilvl w:val="0"/>
+          <w:numId w:val="2"/>
+        </w:numPr>
+      </w:pPr>
+      <w:r>
+        <w:rPr>
+          <w:rFonts w:ascii="Arial" w:hAnsi="Arial" w:cs="Arial"/>
+          <w:b/>
+          <w:bCs/>
+          <w:color w:val="1A202C"/>
+          <w:sz w:val="19"/>
+          <w:szCs w:val="19"/>
+        </w:rPr>
+        <w:t xml:space="preserve">Measurable Impact:</w:t>
+      </w:r>
+      <w:r>
+        <w:rPr>
+          <w:rFonts w:ascii="Arial" w:hAnsi="Arial" w:cs="Arial"/>
+          <w:color w:val="2D3748"/>
+          <w:sz w:val="19"/>
+          <w:szCs w:val="19"/>
+        </w:rPr>
+        <w:t xml:space="preserve">Reduced cross-platform integration complexity by 40%, accelerated feature release velocity, and established reusable component benchmarks across the engineering organization.</w:t>
+      </w:r>
+    </w:p>
+    <w:p>
+      <w:pPr>
+        <w:spacing w:before="110" w:after="15"/>
+      </w:pPr>
+      <w:r>
+        <w:rPr>
+          <w:rFonts w:ascii="Arial" w:hAnsi="Arial" w:cs="Arial"/>
+          <w:b/>
+          <w:bCs/>
+          <w:color w:val="1A202C"/>
+          <w:sz w:val="21"/>
+          <w:szCs w:val="21"/>
+        </w:rPr>
+        <w:t xml:space="preserve">Enterprise CMS Modernization (OpenText TeamSite to AEM) &amp; Cloud Intranet</w:t>
+      </w:r>
+    </w:p>
+    <w:p>
+      <w:pPr>
+        <w:spacing w:before="0" w:after="25"/>
+      </w:pPr>
+      <w:r>
+        <w:rPr>
+          <w:rFonts w:ascii="Arial" w:hAnsi="Arial" w:cs="Arial"/>
+          <w:b/>
+          <w:bCs/>
+          <w:color w:val="2B6CB0"/>
+          <w:sz w:val="19"/>
+          <w:szCs w:val="19"/>
+        </w:rPr>
+        <w:t xml:space="preserve">Citicorp Services India Pvt. Ltd.</w:t>
+      </w:r>
+      <w:r>
+        <w:rPr>
+          <w:rFonts w:ascii="Arial" w:hAnsi="Arial" w:cs="Arial"/>
+          <w:color w:val="4A5568"/>
+          <w:sz w:val="19"/>
+          <w:szCs w:val="19"/>
+        </w:rPr>
+        <w:t xml:space="preserve">|  Applications Development Sr Programmer Analyst  |  2022 – Present</w:t>
+      </w:r>
+    </w:p>
+    <w:p>
+      <w:pPr>
+        <w:spacing w:before="0" w:after="30"/>
+      </w:pPr>
+      <w:r>
+        <w:rPr>
+          <w:rFonts w:ascii="Arial" w:hAnsi="Arial" w:cs="Arial"/>
+          <w:b/>
+          <w:bCs/>
+          <w:color w:val="1A202C"/>
+          <w:sz w:val="18"/>
+          <w:szCs w:val="18"/>
+        </w:rPr>
+        <w:t xml:space="preserve">Technologies:</w:t>
+      </w:r>
+      <w:r>
+        <w:rPr>
+          <w:rFonts w:ascii="Arial" w:hAnsi="Arial" w:cs="Arial"/>
+          <w:i/>
+          <w:iCs/>
+          <w:color w:val="4A5568"/>
+          <w:sz w:val="18"/>
+          <w:szCs w:val="18"/>
+        </w:rPr>
+        <w:t xml:space="preserve">Adobe Experience Manager (AEM 6.5 / Cloud Service), OpenText TeamSite, Angular (v10–v21), Spring Boot 4.x, Docker, OpenShift, GitHub Enterprise, Renovate</w:t>
+      </w:r>
+    </w:p>
+    <w:p>
+      <w:pPr>
+        <w:spacing w:before="20" w:after="20"/>
+        <w:pStyle w:val="ListParagraph"/>
+        <w:numPr>
+          <w:ilvl w:val="0"/>
+          <w:numId w:val="2"/>
+        </w:numPr>
+      </w:pPr>
+      <w:r>
+        <w:rPr>
+          <w:rFonts w:ascii="Arial" w:hAnsi="Arial" w:cs="Arial"/>
+          <w:b/>
+          <w:bCs/>
+          <w:color w:val="1A202C"/>
+          <w:sz w:val="19"/>
+          <w:szCs w:val="19"/>
+        </w:rPr>
+        <w:t xml:space="preserve">CMS Replatforming:</w:t>
+      </w:r>
+      <w:r>
+        <w:rPr>
+          <w:rFonts w:ascii="Arial" w:hAnsi="Arial" w:cs="Arial"/>
+          <w:color w:val="2D3748"/>
+          <w:sz w:val="19"/>
+          <w:szCs w:val="19"/>
+        </w:rPr>
+        <w:t xml:space="preserve">Orchestrated the full migration of Citi's legacy OpenText TeamSite platforms to Adobe Experience Manager (AEM), standardizing multi-brand publishing pipelines, component governance, and authoring workflows.</w:t>
+      </w:r>
+    </w:p>
+    <w:p>
+      <w:pPr>
+        <w:spacing w:before="20" w:after="20"/>
+        <w:pStyle w:val="ListParagraph"/>
+        <w:numPr>
+          <w:ilvl w:val="0"/>
+          <w:numId w:val="2"/>
+        </w:numPr>
+      </w:pPr>
+      <w:r>
+        <w:rPr>
+          <w:rFonts w:ascii="Arial" w:hAnsi="Arial" w:cs="Arial"/>
+          <w:b/>
+          <w:bCs/>
+          <w:color w:val="1A202C"/>
+          <w:sz w:val="19"/>
+          <w:szCs w:val="19"/>
+        </w:rPr>
+        <w:t xml:space="preserve">Angular Modernization &amp; SSR:</w:t>
+      </w:r>
+      <w:r>
+        <w:rPr>
+          <w:rFonts w:ascii="Arial" w:hAnsi="Arial" w:cs="Arial"/>
+          <w:color w:val="2D3748"/>
+          <w:sz w:val="19"/>
+          <w:szCs w:val="19"/>
+        </w:rPr>
+        <w:t xml:space="preserve">Upgraded enterprise intranet applications from Angular 10.x to 21.x across cloud-native microservices, resolving complex Server-Side Rendering (SSR) routing challenges between cloud and legacy modules.</w:t>
+      </w:r>
+    </w:p>
+    <w:p>
+      <w:pPr>
+        <w:spacing w:before="20" w:after="20"/>
+        <w:pStyle w:val="ListParagraph"/>
+        <w:numPr>
+          <w:ilvl w:val="0"/>
+          <w:numId w:val="2"/>
+        </w:numPr>
+      </w:pPr>
+      <w:r>
+        <w:rPr>
+          <w:rFonts w:ascii="Arial" w:hAnsi="Arial" w:cs="Arial"/>
+          <w:b/>
+          <w:bCs/>
+          <w:color w:val="1A202C"/>
+          <w:sz w:val="19"/>
+          <w:szCs w:val="19"/>
+        </w:rPr>
+        <w:t xml:space="preserve">Governance &amp; Automation:</w:t>
+      </w:r>
+      <w:r>
+        <w:rPr>
+          <w:rFonts w:ascii="Arial" w:hAnsi="Arial" w:cs="Arial"/>
+          <w:color w:val="2D3748"/>
+          <w:sz w:val="19"/>
+          <w:szCs w:val="19"/>
+        </w:rPr>
+        <w:t xml:space="preserve">Led technical transition to GitHub Enterprise with automated Renovate dependency patching, remediated application security vulnerabilities, and upgraded core microservices to Spring Boot 4.x with zero downtime.</w:t>
+      </w:r>
+    </w:p>
+    <w:p>
+      <w:pPr>
+        <w:spacing w:before="110" w:after="15"/>
+      </w:pPr>
+      <w:r>
+        <w:rPr>
+          <w:rFonts w:ascii="Arial" w:hAnsi="Arial" w:cs="Arial"/>
+          <w:b/>
+          <w:bCs/>
+          <w:color w:val="1A202C"/>
+          <w:sz w:val="21"/>
+          <w:szCs w:val="21"/>
+        </w:rPr>
+        <w:t xml:space="preserve">Mobile CRM UI Platform &amp; Oracle CRM SOAP Integration</w:t>
+      </w:r>
+    </w:p>
+    <w:p>
+      <w:pPr>
+        <w:spacing w:before="0" w:after="25"/>
+      </w:pPr>
+      <w:r>
+        <w:rPr>
+          <w:rFonts w:ascii="Arial" w:hAnsi="Arial" w:cs="Arial"/>
+          <w:b/>
+          <w:bCs/>
+          <w:color w:val="2B6CB0"/>
+          <w:sz w:val="19"/>
+          <w:szCs w:val="19"/>
+        </w:rPr>
+        <w:t xml:space="preserve">Cognizant Technology Solutions</w:t>
+      </w:r>
+      <w:r>
+        <w:rPr>
+          <w:rFonts w:ascii="Arial" w:hAnsi="Arial" w:cs="Arial"/>
+          <w:color w:val="4A5568"/>
+          <w:sz w:val="19"/>
+          <w:szCs w:val="19"/>
+        </w:rPr>
+        <w:t xml:space="preserve">|  Senior Consultant, CRM UI Architecture  |  2010 – 2013</w:t>
+      </w:r>
+    </w:p>
+    <w:p>
+      <w:pPr>
+        <w:spacing w:before="0" w:after="30"/>
+      </w:pPr>
+      <w:r>
+        <w:rPr>
+          <w:rFonts w:ascii="Arial" w:hAnsi="Arial" w:cs="Arial"/>
+          <w:b/>
+          <w:bCs/>
+          <w:color w:val="1A202C"/>
+          <w:sz w:val="18"/>
+          <w:szCs w:val="18"/>
+        </w:rPr>
+        <w:t xml:space="preserve">Technologies:</w:t>
+      </w:r>
+      <w:r>
+        <w:rPr>
+          <w:rFonts w:ascii="Arial" w:hAnsi="Arial" w:cs="Arial"/>
+          <w:i/>
+          <w:iCs/>
+          <w:color w:val="4A5568"/>
+          <w:sz w:val="18"/>
+          <w:szCs w:val="18"/>
+        </w:rPr>
+        <w:t xml:space="preserve">HTML5, CSS3, JavaScript, Siebel CRM, Oracle CRM SOAP APIs, Google Chrome Optimization</w:t>
+      </w:r>
+    </w:p>
+    <w:p>
+      <w:pPr>
+        <w:spacing w:before="20" w:after="20"/>
+        <w:pStyle w:val="ListParagraph"/>
+        <w:numPr>
+          <w:ilvl w:val="0"/>
+          <w:numId w:val="2"/>
+        </w:numPr>
+      </w:pPr>
+      <w:r>
+        <w:rPr>
+          <w:rFonts w:ascii="Arial" w:hAnsi="Arial" w:cs="Arial"/>
+          <w:b/>
+          <w:bCs/>
+          <w:color w:val="1A202C"/>
+          <w:sz w:val="19"/>
+          <w:szCs w:val="19"/>
+        </w:rPr>
+        <w:t xml:space="preserve">Mobile CRM Architecture:</w:t>
+      </w:r>
+      <w:r>
+        <w:rPr>
+          <w:rFonts w:ascii="Arial" w:hAnsi="Arial" w:cs="Arial"/>
+          <w:color w:val="2D3748"/>
+          <w:sz w:val="19"/>
+          <w:szCs w:val="19"/>
+        </w:rPr>
+        <w:t xml:space="preserve">Architected responsive mobile CRM web applications for enterprise tablets and Google Chrome, significantly boosting field-force productivity across distributed corporate accounts.</w:t>
+      </w:r>
+    </w:p>
+    <w:p>
+      <w:pPr>
+        <w:spacing w:before="20" w:after="20"/>
+        <w:pStyle w:val="ListParagraph"/>
+        <w:numPr>
+          <w:ilvl w:val="0"/>
+          <w:numId w:val="2"/>
+        </w:numPr>
+      </w:pPr>
+      <w:r>
+        <w:rPr>
+          <w:rFonts w:ascii="Arial" w:hAnsi="Arial" w:cs="Arial"/>
+          <w:b/>
+          <w:bCs/>
+          <w:color w:val="1A202C"/>
+          <w:sz w:val="19"/>
+          <w:szCs w:val="19"/>
+        </w:rPr>
+        <w:t xml:space="preserve">API Integration &amp; Usability Auditing:</w:t>
+      </w:r>
+      <w:r>
+        <w:rPr>
+          <w:rFonts w:ascii="Arial" w:hAnsi="Arial" w:cs="Arial"/>
+          <w:color w:val="2D3748"/>
+          <w:sz w:val="19"/>
+          <w:szCs w:val="19"/>
+        </w:rPr>
+        <w:t xml:space="preserve">Developed Oracle CRM API SOAP integrations, established client-side performance benchmarks, and conducted rigorous heuristic UX evaluations and competitive usability testing.</w:t>
+      </w:r>
+    </w:p>
+    <w:p>
+      <w:pPr>
+        <w:spacing w:before="110" w:after="15"/>
+      </w:pPr>
+      <w:r>
+        <w:rPr>
+          <w:rFonts w:ascii="Arial" w:hAnsi="Arial" w:cs="Arial"/>
+          <w:b/>
+          <w:bCs/>
+          <w:color w:val="1A202C"/>
+          <w:sz w:val="21"/>
+          <w:szCs w:val="21"/>
+        </w:rPr>
+        <w:t xml:space="preserve">Enterprise Web Client Architecture &amp; Usability Engineering Suite</w:t>
+      </w:r>
+    </w:p>
+    <w:p>
+      <w:pPr>
+        <w:spacing w:before="0" w:after="25"/>
+      </w:pPr>
+      <w:r>
+        <w:rPr>
+          <w:rFonts w:ascii="Arial" w:hAnsi="Arial" w:cs="Arial"/>
+          <w:b/>
+          <w:bCs/>
+          <w:color w:val="2B6CB0"/>
+          <w:sz w:val="19"/>
+          <w:szCs w:val="19"/>
+        </w:rPr>
+        <w:t xml:space="preserve">Impetus Infotech India Pvt. Ltd.</w:t>
+      </w:r>
+      <w:r>
+        <w:rPr>
+          <w:rFonts w:ascii="Arial" w:hAnsi="Arial" w:cs="Arial"/>
+          <w:color w:val="4A5568"/>
+          <w:sz w:val="19"/>
+          <w:szCs w:val="19"/>
+        </w:rPr>
+        <w:t xml:space="preserve">|  Module Lead UI Developer &amp; Usability Analyst  |  2007 – 2010</w:t>
+      </w:r>
+    </w:p>
+    <w:p>
+      <w:pPr>
+        <w:spacing w:before="0" w:after="30"/>
+      </w:pPr>
+      <w:r>
+        <w:rPr>
+          <w:rFonts w:ascii="Arial" w:hAnsi="Arial" w:cs="Arial"/>
+          <w:b/>
+          <w:bCs/>
+          <w:color w:val="1A202C"/>
+          <w:sz w:val="18"/>
+          <w:szCs w:val="18"/>
+        </w:rPr>
+        <w:t xml:space="preserve">Technologies:</w:t>
+      </w:r>
+      <w:r>
+        <w:rPr>
+          <w:rFonts w:ascii="Arial" w:hAnsi="Arial" w:cs="Arial"/>
+          <w:i/>
+          <w:iCs/>
+          <w:color w:val="4A5568"/>
+          <w:sz w:val="18"/>
+          <w:szCs w:val="18"/>
+        </w:rPr>
+        <w:t xml:space="preserve">JavaScript, DOM Scripting, Usability Testing, Heuristic Evaluation, Cross-Browser Compatibility</w:t>
+      </w:r>
+    </w:p>
+    <w:p>
+      <w:pPr>
+        <w:spacing w:before="20" w:after="20"/>
+        <w:pStyle w:val="ListParagraph"/>
+        <w:numPr>
+          <w:ilvl w:val="0"/>
+          <w:numId w:val="2"/>
+        </w:numPr>
+      </w:pPr>
+      <w:r>
+        <w:rPr>
+          <w:rFonts w:ascii="Arial" w:hAnsi="Arial" w:cs="Arial"/>
+          <w:b/>
+          <w:bCs/>
+          <w:color w:val="1A202C"/>
+          <w:sz w:val="19"/>
+          <w:szCs w:val="19"/>
+        </w:rPr>
+        <w:t xml:space="preserve">Pod Leadership &amp; Concept Implementation:</w:t>
+      </w:r>
+      <w:r>
+        <w:rPr>
+          <w:rFonts w:ascii="Arial" w:hAnsi="Arial" w:cs="Arial"/>
+          <w:color w:val="2D3748"/>
+          <w:sz w:val="19"/>
+          <w:szCs w:val="19"/>
+        </w:rPr>
+        <w:t xml:space="preserve">Led UI engineering pods translating concept visualizations into robust web client architectures, governing frontend coding benchmarks and W3C standards compliance.</w:t>
+      </w:r>
+    </w:p>
+    <w:p>
+      <w:pPr>
+        <w:spacing w:before="20" w:after="20"/>
+        <w:pStyle w:val="ListParagraph"/>
+        <w:numPr>
+          <w:ilvl w:val="0"/>
+          <w:numId w:val="2"/>
+        </w:numPr>
+      </w:pPr>
+      <w:r>
+        <w:rPr>
+          <w:rFonts w:ascii="Arial" w:hAnsi="Arial" w:cs="Arial"/>
+          <w:b/>
+          <w:bCs/>
+          <w:color w:val="1A202C"/>
+          <w:sz w:val="19"/>
+          <w:szCs w:val="19"/>
+        </w:rPr>
+        <w:t xml:space="preserve">Usability Analysis:</w:t>
+      </w:r>
+      <w:r>
+        <w:rPr>
+          <w:rFonts w:ascii="Arial" w:hAnsi="Arial" w:cs="Arial"/>
+          <w:color w:val="2D3748"/>
+          <w:sz w:val="19"/>
+          <w:szCs w:val="19"/>
+        </w:rPr>
+        <w:t xml:space="preserve">Directed structured usability studies, heuristic UX evaluations, and competitive analysis to streamline application navigation flows and maximize end-user efficiency.</w:t>
       </w:r>
     </w:p>
     <w:p>

</xml_diff>

<commit_message>
feat(projects): separate enterprise and personal projects across portfolio, resume, cv, docx, pdf, and edge copilot
</commit_message>
<xml_diff>
--- a/Ravindrakumar_Suthar_Resume.docx
+++ b/Ravindrakumar_Suthar_Resume.docx
@@ -1925,7 +1925,7 @@
           <w:sz w:val="23"/>
           <w:szCs w:val="23"/>
         </w:rPr>
-        <w:t xml:space="preserve">KEY ENTERPRISE &amp; COMPANY PROJECTS</w:t>
+        <w:t xml:space="preserve">ENTERPRISE &amp; COMPANY PROJECTS</w:t>
       </w:r>
     </w:p>
     <w:p>
@@ -2832,7 +2832,7 @@
           <w:sz w:val="23"/>
           <w:szCs w:val="23"/>
         </w:rPr>
-        <w:t xml:space="preserve">FEATURED TECHNICAL INNOVATIONS &amp; OPEN SYSTEMS</w:t>
+        <w:t xml:space="preserve">PERSONAL &amp; OPEN-SOURCE PROJECTS</w:t>
       </w:r>
     </w:p>
     <w:p>
@@ -2858,31 +2858,6 @@
           <w:szCs w:val="19"/>
         </w:rPr>
         <w:t xml:space="preserve">Continuous digital accessibility platform engineered to eliminate audit fragmentation and noise. Combines a concurrent triple-engine consensus architecture (IBM Equal Access 4.0, Deque Axe-core 4.10, and HTML_CodeSniffer 2.5) with an interactive, collision-free Shadow DOM HUD that mounts directly onto live web applications via script tag or bookmarklet. Provides on-hover element highlighting, real-time contrast inspection, and actionable code remediation snippets with zero data retention (100% client-side DOM evaluation) across WCAG 2.1/2.2 Levels A/AA/AAA, Section 508, and EN 301 549 (a11ysis.lets.gen.in).</w:t>
-      </w:r>
-    </w:p>
-    <w:p>
-      <w:pPr>
-        <w:spacing w:before="25" w:after="25"/>
-      </w:pPr>
-      <w:r>
-        <w:rPr>
-          <w:rFonts w:ascii="Arial" w:hAnsi="Arial" w:cs="Arial"/>
-          <w:b/>
-          <w:bCs/>
-          <w:color w:val="1A202C"/>
-          <w:sz w:val="19"/>
-          <w:szCs w:val="19"/>
-        </w:rPr>
-        <w:t xml:space="preserve">FoodScan AI (AI Dietary Scanner &amp; Label Decoder):</w:t>
-      </w:r>
-      <w:r>
-        <w:rPr>
-          <w:rFonts w:ascii="Arial" w:hAnsi="Arial" w:cs="Arial"/>
-          <w:color w:val="2D3748"/>
-          <w:sz w:val="19"/>
-          <w:szCs w:val="19"/>
-        </w:rPr>
-        <w:t xml:space="preserve">Mobile AI application officially published on the Google Play Store engineered for conscious travelers (Vegetarian, Jain, Vegan, Celiac gluten-free, and severe allergen sufferers). Leverages dual barcode scanning and multilingual OCR to decode foreign food labels (French, German, Japanese, etc.) and European E-numbers in under one second with deterministic dietary safeguards (play.google.com/store/apps/details?id=in.gen.lets.foodscan | foodscan.lets.gen.in/packaging-marks).</w:t>
       </w:r>
     </w:p>
     <w:p>

</xml_diff>

<commit_message>
feat(executive): address recruiter & manager gaps, add fast-track snapshot, visual architecture diagrams, and leadership governance matrix
</commit_message>
<xml_diff>
--- a/Ravindrakumar_Suthar_Resume.docx
+++ b/Ravindrakumar_Suthar_Resume.docx
@@ -628,7 +628,7 @@
           <w:sz w:val="21"/>
           <w:szCs w:val="21"/>
         </w:rPr>
-        <w:t xml:space="preserve">Applications Development Sr Programmer Analyst</w:t>
+        <w:t xml:space="preserve">Senior Principal Architect &amp; AI Platform Lead (Corporate: Applications Development Sr Programmer Analyst)</w:t>
       </w:r>
     </w:p>
     <w:p>
@@ -775,16 +775,16 @@
           <w:sz w:val="19"/>
           <w:szCs w:val="19"/>
         </w:rPr>
-        <w:t xml:space="preserve">Led cross-functional frontend engineering squads (~12 engineers):</w:t>
-      </w:r>
-      <w:r>
-        <w:rPr>
-          <w:rFonts w:ascii="Arial" w:hAnsi="Arial" w:cs="Arial"/>
-          <w:color w:val="2D3748"/>
-          <w:sz w:val="19"/>
-          <w:szCs w:val="19"/>
-        </w:rPr>
-        <w:t xml:space="preserve">with sustained under 8% attrition through structured 1-on-1s, technical skill ladders, and internal Communities of Practice.</w:t>
+        <w:t xml:space="preserve">Organizational leadership &amp; cross-functional scale:</w:t>
+      </w:r>
+      <w:r>
+        <w:rPr>
+          <w:rFonts w:ascii="Arial" w:hAnsi="Arial" w:cs="Arial"/>
+          <w:color w:val="2D3748"/>
+          <w:sz w:val="19"/>
+          <w:szCs w:val="19"/>
+        </w:rPr>
+        <w:t xml:space="preserve">Directly led cross-functional frontend engineering squads (~12 engineers) with sustained under 8% attrition; formulated enterprise UI architectures, design tokens, and AI tooling adopted by 150+ engineers across 6+ business lines.</w:t>
       </w:r>
     </w:p>
     <w:p>
@@ -1040,7 +1040,7 @@
           <w:sz w:val="21"/>
           <w:szCs w:val="21"/>
         </w:rPr>
-        <w:t xml:space="preserve">Applications Development Manager</w:t>
+        <w:t xml:space="preserve">Senior Lead Engineer — Frontend Architecture (Corporate: Applications Development Manager)</w:t>
       </w:r>
     </w:p>
     <w:p>

</xml_diff>